<commit_message>
Log detector probability; add threshold sweep and figure sync
</commit_message>
<xml_diff>
--- a/docs/PartB_Draft_STT.docx
+++ b/docs/PartB_Draft_STT.docx
@@ -3764,7 +3764,7 @@
                 <w:sz w:val="19"/>
                 <w:szCs w:val="19"/>
               </w:rPr>
-              <w:t xml:space="preserve">0.401</w:t>
+              <w:t>0.429</w:t>
             </w:r>
           </w:p>
         </w:tc>
@@ -3789,7 +3789,7 @@
                 <w:sz w:val="19"/>
                 <w:szCs w:val="19"/>
               </w:rPr>
-              <w:t xml:space="preserve">0.393</w:t>
+              <w:t>0.419</w:t>
             </w:r>
           </w:p>
         </w:tc>
@@ -3814,7 +3814,7 @@
                 <w:sz w:val="19"/>
                 <w:szCs w:val="19"/>
               </w:rPr>
-              <w:t xml:space="preserve">114</w:t>
+              <w:t>124</w:t>
             </w:r>
           </w:p>
         </w:tc>
@@ -3839,7 +3839,7 @@
                 <w:sz w:val="19"/>
                 <w:szCs w:val="19"/>
               </w:rPr>
-              <w:t xml:space="preserve">15</w:t>
+              <w:t>14</w:t>
             </w:r>
           </w:p>
         </w:tc>
@@ -3864,7 +3864,7 @@
                 <w:sz w:val="19"/>
                 <w:szCs w:val="19"/>
               </w:rPr>
-              <w:t xml:space="preserve">26</w:t>
+              <w:t>28</w:t>
             </w:r>
           </w:p>
         </w:tc>
@@ -3919,7 +3919,7 @@
                 <w:sz w:val="19"/>
                 <w:szCs w:val="19"/>
               </w:rPr>
-              <w:t xml:space="preserve">0.457</w:t>
+              <w:t>0.447</w:t>
             </w:r>
           </w:p>
         </w:tc>
@@ -3944,7 +3944,7 @@
                 <w:sz w:val="19"/>
                 <w:szCs w:val="19"/>
               </w:rPr>
-              <w:t xml:space="preserve">0.447</w:t>
+              <w:t>0.439</w:t>
             </w:r>
           </w:p>
         </w:tc>
@@ -3969,7 +3969,7 @@
                 <w:sz w:val="19"/>
                 <w:szCs w:val="19"/>
               </w:rPr>
-              <w:t xml:space="preserve">132</w:t>
+              <w:t>108</w:t>
             </w:r>
           </w:p>
         </w:tc>
@@ -3994,7 +3994,7 @@
                 <w:sz w:val="19"/>
                 <w:szCs w:val="19"/>
               </w:rPr>
-              <w:t xml:space="preserve">18</w:t>
+              <w:t>15</w:t>
             </w:r>
           </w:p>
         </w:tc>
@@ -4019,7 +4019,7 @@
                 <w:sz w:val="19"/>
                 <w:szCs w:val="19"/>
               </w:rPr>
-              <w:t xml:space="preserve">27</w:t>
+              <w:t>50</w:t>
             </w:r>
           </w:p>
         </w:tc>
@@ -4074,7 +4074,7 @@
                 <w:sz w:val="19"/>
                 <w:szCs w:val="19"/>
               </w:rPr>
-              <w:t xml:space="preserve">0.589</w:t>
+              <w:t>0.592</w:t>
             </w:r>
           </w:p>
         </w:tc>
@@ -4099,7 +4099,7 @@
                 <w:sz w:val="19"/>
                 <w:szCs w:val="19"/>
               </w:rPr>
-              <w:t xml:space="preserve">0.579</w:t>
+              <w:t>0.581</w:t>
             </w:r>
           </w:p>
         </w:tc>
@@ -4124,7 +4124,7 @@
                 <w:sz w:val="19"/>
                 <w:szCs w:val="19"/>
               </w:rPr>
-              <w:t xml:space="preserve">151</w:t>
+              <w:t>166</w:t>
             </w:r>
           </w:p>
         </w:tc>
@@ -4149,7 +4149,7 @@
                 <w:sz w:val="19"/>
                 <w:szCs w:val="19"/>
               </w:rPr>
-              <w:t xml:space="preserve">5</w:t>
+              <w:t>8</w:t>
             </w:r>
           </w:p>
         </w:tc>
@@ -4174,7 +4174,7 @@
                 <w:sz w:val="19"/>
                 <w:szCs w:val="19"/>
               </w:rPr>
-              <w:t xml:space="preserve">72</w:t>
+              <w:t>55</w:t>
             </w:r>
           </w:p>
         </w:tc>
@@ -4694,7 +4694,7 @@
           <w:sz w:val="22"/>
           <w:szCs w:val="22"/>
         </w:rPr>
-        <w:t xml:space="preserve">Supplying a short code-switched sample as decoder context lowers WER by roughly 22 percentage points on both models (0.618 → 0.398 for the Malaysian model). Whisper's decoder is simultaneously an acoustic model and a language model; where audio is ambiguous, the language-model prior breaks the tie, and in-domain context shifts that prior toward rojak orthography. It is not an instruction — the model will not obey commands placed in the prompt.</w:t>
+        <w:t>Supplying a short code-switched sample as decoder context lowers WER substantially on both models: 22 percentage points on the Malaysian checkpoint (0.618 → 0.398) and 14 on the base model (0.592 → 0.447). Whisper's decoder is simultaneously an acoustic model and a language model; where audio is ambiguous, the language-model prior breaks the tie, and in-domain context shifts that prior toward rojak orthography. It is not an instruction — the model will not obey commands placed in the prompt.</w:t>
       </w:r>
     </w:p>
     <w:p>
@@ -4740,7 +4740,7 @@
           <w:sz w:val="22"/>
           <w:szCs w:val="22"/>
         </w:rPr>
-        <w:t xml:space="preserve">At equal prompt conditions, 0.398 against 0.457. The advantage is consistent rather than marginal, and is expected given the checkpoint was distilled on Malaysian speech including Manglish.</w:t>
+        <w:t>At equal prompt conditions, 0.398 against 0.447. The advantage is consistent rather than marginal, and is expected given the checkpoint was distilled on Malaysian speech including Manglish.</w:t>
       </w:r>
     </w:p>
     <w:p>
@@ -5997,7 +5997,7 @@
           <w:sz w:val="22"/>
           <w:szCs w:val="22"/>
         </w:rPr>
-        <w:t xml:space="preserve">The target was set before any measurement was taken. Published WER for Malay-English code-switched ASR with a small-class model typically falls in the 0.30–0.50 range, so 0.25 was optimistic for this model size. The result is reported as measured; the relative improvements are the substantive claim: prompting reduced WER by 22 points, the Malaysian fine-tune by a further 6, and language routing by 5, for a total reduction from 0.618 to 0.349 — a 44% relative improvement over the unassisted baseline.</w:t>
+        <w:t>The target was set before any measurement was taken. Published WER for Malay-English code-switched ASR with a small-class model typically falls in the 0.30–0.50 range, so 0.25 was optimistic for this model size. The result is reported as measured; the relative improvements are the substantive claim: prompting reduced WER by 22 points, with the Malaysian fine-tune and language routing contributing a further 5 points each, for a total reduction from 0.618 to 0.349 — a 44% relative improvement over the unassisted baseline.</w:t>
       </w:r>
     </w:p>
     <w:p>

</xml_diff>

<commit_message>
Updated assignment report regarding the p_en
</commit_message>
<xml_diff>
--- a/docs/PartB_Draft_STT.docx
+++ b/docs/PartB_Draft_STT.docx
@@ -1753,7 +1753,7 @@
           <w:sz w:val="17"/>
           <w:szCs w:val="17"/>
         </w:rPr>
-        <w:t xml:space="preserve">    IF Argmax(probs) = 'en' AND probs['en'] &gt; 0.5 THEN</w:t>
+        <w:t xml:space="preserve">    p_en       &lt;- probs['en']          // recorded for sensitivity analysis</w:t>
       </w:r>
     </w:p>
     <w:p>
@@ -1766,7 +1766,7 @@
           <w:sz w:val="17"/>
           <w:szCs w:val="17"/>
         </w:rPr>
-        <w:t xml:space="preserve">            lang &lt;- 'en'</w:t>
+        <w:t xml:space="preserve">    IF Argmax(probs) = 'en' AND p_en &gt; EN_THRESHOLD THEN</w:t>
       </w:r>
     </w:p>
     <w:p>
@@ -1779,7 +1779,7 @@
           <w:sz w:val="17"/>
           <w:szCs w:val="17"/>
         </w:rPr>
-        <w:t xml:space="preserve">    ELSE</w:t>
+        <w:t xml:space="preserve">            lang &lt;- 'en'</w:t>
       </w:r>
     </w:p>
     <w:p>
@@ -1792,7 +1792,20 @@
           <w:sz w:val="17"/>
           <w:szCs w:val="17"/>
         </w:rPr>
-        <w:t xml:space="preserve">            lang &lt;- 'ms'        // asymmetric: a wrong 'en' is far costlier</w:t>
+        <w:t xml:space="preserve">    ELSE</w:t>
+      </w:r>
+    </w:p>
+    <w:p>
+      <w:pPr>
+        <w:spacing w:after="0" w:line="230"/>
+      </w:pPr>
+      <w:r>
+        <w:rPr>
+          <w:rFonts w:ascii="Consolas" w:cs="Consolas" w:eastAsia="Consolas" w:hAnsi="Consolas"/>
+          <w:sz w:val="17"/>
+          <w:szCs w:val="17"/>
+        </w:rPr>
+        <w:t xml:space="preserve">            lang &lt;- 'ms'        // asymmetric: a wrong 'en' is rare but unbounded</w:t>
       </w:r>
     </w:p>
     <w:p>
@@ -5123,7 +5136,24 @@
           <w:sz w:val="22"/>
           <w:szCs w:val="22"/>
         </w:rPr>
-        <w:t xml:space="preserve">The checkpoint therefore transcribes English competently — its language detector is the defect. The resolution is a two-model pipeline: base Whisper performs language identification (one encoder pass, unbiased), and the Malaysian model transcribes using that token. The threshold is deliberately asymmetric, requiring confident English before selecting it, because a wrong 'en' costs an order of magnitude more than a wrong 'ms'. Routing reduced overall WER from 0.398 to 0.349.</w:t>
+        <w:t>The checkpoint therefore transcribes English competently — its language detector is the defect. The resolution is a two-model pipeline: base Whisper performs language identification (one encoder pass, unbiased), and the Malaysian model transcribes using that token. Routing reduced overall WER from 0.398 to 0.349.</w:t>
+      </w:r>
+    </w:p>
+    <w:p>
+      <w:pPr>
+        <w:spacing w:after="120" w:line="300"/>
+      </w:pPr>
+      <w:r>
+        <w:rPr>
+          <w:b/>
+        </w:rPr>
+        <w:t xml:space="preserve">The threshold is deliberately asymmetric, </w:t>
+      </w:r>
+      <w:r>
+        <w:rPr>
+          <w:b w:val="0"/>
+        </w:rPr>
+        <w:t>requiring confident English before it is selected, because the two errors are not equally expensive. Per-clip inspection shows the asymmetry is narrower than the aggregate figure suggests. Under forced English, seven of the eight ms_dom clips transcribe correctly or near-correctly (0, 0, 0, 0, 1, 1 and 5 errors), and the entire 6.483 category figure is produced by one clip, s05_pq, which enters runaway repetition and accumulates 362 insertions against a seven-word reference. Forcing the wrong language is therefore not uniformly catastrophic; it is usually harmless and occasionally unbounded. A low-probability, unbounded loss still justifies caution — WER has no upper limit, so a single such clip can dominate a corpus of this size — but the justification is expected cost under a heavy tail, not uniform damage.</w:t>
       </w:r>
     </w:p>
     <w:p>
@@ -5132,7 +5162,1924 @@
         <w:spacing w:after="140" w:before="280"/>
       </w:pPr>
       <w:r>
-        <w:t xml:space="preserve">5. Error analysis by switch type</w:t>
+        <w:rPr>
+          <w:b w:val="0"/>
+        </w:rPr>
+        <w:t>5. Threshold sensitivity of the routing decision</w:t>
+      </w:r>
+    </w:p>
+    <w:p>
+      <w:pPr>
+        <w:spacing w:after="120" w:line="300"/>
+      </w:pPr>
+      <w:r>
+        <w:rPr>
+          <w:b w:val="0"/>
+        </w:rPr>
+        <w:t>The routing decision was originally logged only as its outcome, 'en' or 'ms'. That record cannot distinguish two situations with opposite implications: a clip whose English is heard but scored just below the cutoff, which would mean the constant is mis-set, from a clip whose English is not heard at all, which would mean routing has reached its ceiling. The detector's English probability is therefore now recorded per clip (run_wer.py --detect-only, writing detector_probs.csv).</w:t>
+      </w:r>
+    </w:p>
+    <w:tbl>
+      <w:tblPr>
+        <w:tblW w:type="dxa" w:w="9360"/>
+        <w:tblBorders>
+          <w:top w:val="single" w:color="auto" w:sz="4"/>
+          <w:left w:val="single" w:color="auto" w:sz="4"/>
+          <w:bottom w:val="single" w:color="auto" w:sz="4"/>
+          <w:right w:val="single" w:color="auto" w:sz="4"/>
+          <w:insideH w:val="single" w:color="auto" w:sz="4"/>
+          <w:insideV w:val="single" w:color="auto" w:sz="4"/>
+        </w:tblBorders>
+      </w:tblPr>
+      <w:tblGrid>
+        <w:gridCol w:w="700"/>
+        <w:gridCol w:w="1700"/>
+        <w:gridCol w:w="5200"/>
+        <w:gridCol w:w="1760"/>
+      </w:tblGrid>
+      <w:tr>
+        <w:trPr>
+          <w:tblHeader/>
+        </w:trPr>
+        <w:tc>
+          <w:tcPr>
+            <w:tcW w:type="dxa" w:w="700"/>
+            <w:shd w:fill="1F3864" w:val="clear"/>
+            <w:tcMar>
+              <w:top w:type="dxa" w:w="60"/>
+              <w:left w:type="dxa" w:w="100"/>
+              <w:bottom w:type="dxa" w:w="60"/>
+              <w:right w:type="dxa" w:w="100"/>
+            </w:tcMar>
+          </w:tcPr>
+          <w:p>
+            <w:pPr>
+              <w:jc w:val="left"/>
+            </w:pPr>
+            <w:r>
+              <w:rPr>
+                <w:rFonts w:ascii="Arial" w:cs="Arial" w:eastAsia="Arial" w:hAnsi="Arial"/>
+                <w:b/>
+                <w:bCs/>
+                <w:color w:val="FFFFFF"/>
+                <w:sz w:val="19"/>
+                <w:szCs w:val="19"/>
+              </w:rPr>
+              <w:t>Category</w:t>
+            </w:r>
+          </w:p>
+        </w:tc>
+        <w:tc>
+          <w:tcPr>
+            <w:tcW w:type="dxa" w:w="1700"/>
+            <w:shd w:fill="1F3864" w:val="clear"/>
+            <w:tcMar>
+              <w:top w:type="dxa" w:w="60"/>
+              <w:left w:type="dxa" w:w="100"/>
+              <w:bottom w:type="dxa" w:w="60"/>
+              <w:right w:type="dxa" w:w="100"/>
+            </w:tcMar>
+          </w:tcPr>
+          <w:p>
+            <w:pPr>
+              <w:jc w:val="left"/>
+            </w:pPr>
+            <w:r>
+              <w:rPr>
+                <w:rFonts w:ascii="Arial" w:cs="Arial" w:eastAsia="Arial" w:hAnsi="Arial"/>
+                <w:b/>
+                <w:bCs/>
+                <w:color w:val="FFFFFF"/>
+                <w:sz w:val="19"/>
+                <w:szCs w:val="19"/>
+              </w:rPr>
+              <w:t>p_en median</w:t>
+            </w:r>
+          </w:p>
+        </w:tc>
+        <w:tc>
+          <w:tcPr>
+            <w:tcW w:type="dxa" w:w="5200"/>
+            <w:shd w:fill="1F3864" w:val="clear"/>
+            <w:tcMar>
+              <w:top w:type="dxa" w:w="60"/>
+              <w:left w:type="dxa" w:w="100"/>
+              <w:bottom w:type="dxa" w:w="60"/>
+              <w:right w:type="dxa" w:w="100"/>
+            </w:tcMar>
+          </w:tcPr>
+          <w:p>
+            <w:pPr>
+              <w:jc w:val="left"/>
+            </w:pPr>
+            <w:r>
+              <w:rPr>
+                <w:rFonts w:ascii="Arial" w:cs="Arial" w:eastAsia="Arial" w:hAnsi="Arial"/>
+                <w:b/>
+                <w:bCs/>
+                <w:color w:val="FFFFFF"/>
+                <w:sz w:val="19"/>
+                <w:szCs w:val="19"/>
+              </w:rPr>
+              <w:t>p_en range</w:t>
+            </w:r>
+          </w:p>
+        </w:tc>
+        <w:tc>
+          <w:tcPr>
+            <w:tcW w:type="dxa" w:w="1760"/>
+            <w:shd w:fill="1F3864" w:val="clear"/>
+            <w:tcMar>
+              <w:top w:type="dxa" w:w="60"/>
+              <w:left w:type="dxa" w:w="100"/>
+              <w:bottom w:type="dxa" w:w="60"/>
+              <w:right w:type="dxa" w:w="100"/>
+            </w:tcMar>
+          </w:tcPr>
+          <w:p>
+            <w:pPr>
+              <w:jc w:val="left"/>
+            </w:pPr>
+            <w:r>
+              <w:rPr>
+                <w:rFonts w:ascii="Arial" w:cs="Arial" w:eastAsia="Arial" w:hAnsi="Arial"/>
+                <w:b/>
+                <w:bCs/>
+                <w:color w:val="FFFFFF"/>
+                <w:sz w:val="19"/>
+                <w:szCs w:val="19"/>
+              </w:rPr>
+              <w:t>Routed to English</w:t>
+            </w:r>
+          </w:p>
+        </w:tc>
+      </w:tr>
+      <w:tr>
+        <w:trPr>
+          <w:tblHeader w:val="false"/>
+        </w:trPr>
+        <w:tc>
+          <w:tcPr>
+            <w:tcW w:type="dxa" w:w="700"/>
+            <w:tcMar>
+              <w:top w:type="dxa" w:w="60"/>
+              <w:left w:type="dxa" w:w="100"/>
+              <w:bottom w:type="dxa" w:w="60"/>
+              <w:right w:type="dxa" w:w="100"/>
+            </w:tcMar>
+          </w:tcPr>
+          <w:p>
+            <w:pPr>
+              <w:jc w:val="left"/>
+            </w:pPr>
+            <w:r>
+              <w:rPr>
+                <w:rFonts w:ascii="Arial" w:cs="Arial" w:eastAsia="Arial" w:hAnsi="Arial"/>
+                <w:b w:val="0"/>
+                <w:color w:val="000000"/>
+                <w:sz w:val="19"/>
+                <w:szCs w:val="19"/>
+              </w:rPr>
+              <w:t>en_dom</w:t>
+            </w:r>
+          </w:p>
+        </w:tc>
+        <w:tc>
+          <w:tcPr>
+            <w:tcW w:type="dxa" w:w="1700"/>
+            <w:tcMar>
+              <w:top w:type="dxa" w:w="60"/>
+              <w:left w:type="dxa" w:w="100"/>
+              <w:bottom w:type="dxa" w:w="60"/>
+              <w:right w:type="dxa" w:w="100"/>
+            </w:tcMar>
+          </w:tcPr>
+          <w:p>
+            <w:pPr>
+              <w:jc w:val="left"/>
+            </w:pPr>
+            <w:r>
+              <w:rPr>
+                <w:rFonts w:ascii="Arial" w:cs="Arial" w:eastAsia="Arial" w:hAnsi="Arial"/>
+                <w:b w:val="0"/>
+                <w:color w:val="000000"/>
+                <w:sz w:val="19"/>
+                <w:szCs w:val="19"/>
+              </w:rPr>
+              <w:t>0.234</w:t>
+            </w:r>
+          </w:p>
+        </w:tc>
+        <w:tc>
+          <w:tcPr>
+            <w:tcW w:type="dxa" w:w="5200"/>
+            <w:tcMar>
+              <w:top w:type="dxa" w:w="60"/>
+              <w:left w:type="dxa" w:w="100"/>
+              <w:bottom w:type="dxa" w:w="60"/>
+              <w:right w:type="dxa" w:w="100"/>
+            </w:tcMar>
+          </w:tcPr>
+          <w:p>
+            <w:pPr>
+              <w:jc w:val="left"/>
+            </w:pPr>
+            <w:r>
+              <w:rPr>
+                <w:rFonts w:ascii="Arial" w:cs="Arial" w:eastAsia="Arial" w:hAnsi="Arial"/>
+                <w:b w:val="0"/>
+                <w:color w:val="000000"/>
+                <w:sz w:val="19"/>
+                <w:szCs w:val="19"/>
+              </w:rPr>
+              <w:t>0.067 – 0.671</w:t>
+            </w:r>
+          </w:p>
+        </w:tc>
+        <w:tc>
+          <w:tcPr>
+            <w:tcW w:type="dxa" w:w="1760"/>
+            <w:tcMar>
+              <w:top w:type="dxa" w:w="60"/>
+              <w:left w:type="dxa" w:w="100"/>
+              <w:bottom w:type="dxa" w:w="60"/>
+              <w:right w:type="dxa" w:w="100"/>
+            </w:tcMar>
+          </w:tcPr>
+          <w:p>
+            <w:pPr>
+              <w:jc w:val="left"/>
+            </w:pPr>
+            <w:r>
+              <w:rPr>
+                <w:rFonts w:ascii="Arial" w:cs="Arial" w:eastAsia="Arial" w:hAnsi="Arial"/>
+                <w:b w:val="0"/>
+                <w:color w:val="000000"/>
+                <w:sz w:val="19"/>
+                <w:szCs w:val="19"/>
+              </w:rPr>
+              <w:t>3 of 8</w:t>
+            </w:r>
+          </w:p>
+        </w:tc>
+      </w:tr>
+      <w:tr>
+        <w:trPr>
+          <w:tblHeader w:val="false"/>
+        </w:trPr>
+        <w:tc>
+          <w:tcPr>
+            <w:tcW w:type="dxa" w:w="700"/>
+            <w:tcMar>
+              <w:top w:type="dxa" w:w="60"/>
+              <w:left w:type="dxa" w:w="100"/>
+              <w:bottom w:type="dxa" w:w="60"/>
+              <w:right w:type="dxa" w:w="100"/>
+            </w:tcMar>
+          </w:tcPr>
+          <w:p>
+            <w:pPr>
+              <w:jc w:val="left"/>
+            </w:pPr>
+            <w:r>
+              <w:rPr>
+                <w:rFonts w:ascii="Arial" w:cs="Arial" w:eastAsia="Arial" w:hAnsi="Arial"/>
+                <w:b w:val="0"/>
+                <w:color w:val="000000"/>
+                <w:sz w:val="19"/>
+                <w:szCs w:val="19"/>
+              </w:rPr>
+              <w:t>particles</w:t>
+            </w:r>
+          </w:p>
+        </w:tc>
+        <w:tc>
+          <w:tcPr>
+            <w:tcW w:type="dxa" w:w="1700"/>
+            <w:tcMar>
+              <w:top w:type="dxa" w:w="60"/>
+              <w:left w:type="dxa" w:w="100"/>
+              <w:bottom w:type="dxa" w:w="60"/>
+              <w:right w:type="dxa" w:w="100"/>
+            </w:tcMar>
+          </w:tcPr>
+          <w:p>
+            <w:pPr>
+              <w:jc w:val="left"/>
+            </w:pPr>
+            <w:r>
+              <w:rPr>
+                <w:rFonts w:ascii="Arial" w:cs="Arial" w:eastAsia="Arial" w:hAnsi="Arial"/>
+                <w:b w:val="0"/>
+                <w:color w:val="000000"/>
+                <w:sz w:val="19"/>
+                <w:szCs w:val="19"/>
+              </w:rPr>
+              <w:t>0.011</w:t>
+            </w:r>
+          </w:p>
+        </w:tc>
+        <w:tc>
+          <w:tcPr>
+            <w:tcW w:type="dxa" w:w="5200"/>
+            <w:tcMar>
+              <w:top w:type="dxa" w:w="60"/>
+              <w:left w:type="dxa" w:w="100"/>
+              <w:bottom w:type="dxa" w:w="60"/>
+              <w:right w:type="dxa" w:w="100"/>
+            </w:tcMar>
+          </w:tcPr>
+          <w:p>
+            <w:pPr>
+              <w:jc w:val="left"/>
+            </w:pPr>
+            <w:r>
+              <w:rPr>
+                <w:rFonts w:ascii="Arial" w:cs="Arial" w:eastAsia="Arial" w:hAnsi="Arial"/>
+                <w:b w:val="0"/>
+                <w:color w:val="000000"/>
+                <w:sz w:val="19"/>
+                <w:szCs w:val="19"/>
+              </w:rPr>
+              <w:t>0.000 – 0.466</w:t>
+            </w:r>
+          </w:p>
+        </w:tc>
+        <w:tc>
+          <w:tcPr>
+            <w:tcW w:type="dxa" w:w="1760"/>
+            <w:tcMar>
+              <w:top w:type="dxa" w:w="60"/>
+              <w:left w:type="dxa" w:w="100"/>
+              <w:bottom w:type="dxa" w:w="60"/>
+              <w:right w:type="dxa" w:w="100"/>
+            </w:tcMar>
+          </w:tcPr>
+          <w:p>
+            <w:pPr>
+              <w:jc w:val="left"/>
+            </w:pPr>
+            <w:r>
+              <w:rPr>
+                <w:rFonts w:ascii="Arial" w:cs="Arial" w:eastAsia="Arial" w:hAnsi="Arial"/>
+                <w:b w:val="0"/>
+                <w:color w:val="000000"/>
+                <w:sz w:val="19"/>
+                <w:szCs w:val="19"/>
+              </w:rPr>
+              <w:t>0 of 8</w:t>
+            </w:r>
+          </w:p>
+        </w:tc>
+      </w:tr>
+      <w:tr>
+        <w:trPr>
+          <w:tblHeader w:val="false"/>
+        </w:trPr>
+        <w:tc>
+          <w:tcPr>
+            <w:tcW w:type="dxa" w:w="700"/>
+            <w:tcMar>
+              <w:top w:type="dxa" w:w="60"/>
+              <w:left w:type="dxa" w:w="100"/>
+              <w:bottom w:type="dxa" w:w="60"/>
+              <w:right w:type="dxa" w:w="100"/>
+            </w:tcMar>
+          </w:tcPr>
+          <w:p>
+            <w:pPr>
+              <w:jc w:val="left"/>
+            </w:pPr>
+            <w:r>
+              <w:rPr>
+                <w:rFonts w:ascii="Arial" w:cs="Arial" w:eastAsia="Arial" w:hAnsi="Arial"/>
+                <w:b w:val="0"/>
+                <w:color w:val="000000"/>
+                <w:sz w:val="19"/>
+                <w:szCs w:val="19"/>
+              </w:rPr>
+              <w:t>numeric</w:t>
+            </w:r>
+          </w:p>
+        </w:tc>
+        <w:tc>
+          <w:tcPr>
+            <w:tcW w:type="dxa" w:w="1700"/>
+            <w:tcMar>
+              <w:top w:type="dxa" w:w="60"/>
+              <w:left w:type="dxa" w:w="100"/>
+              <w:bottom w:type="dxa" w:w="60"/>
+              <w:right w:type="dxa" w:w="100"/>
+            </w:tcMar>
+          </w:tcPr>
+          <w:p>
+            <w:pPr>
+              <w:jc w:val="left"/>
+            </w:pPr>
+            <w:r>
+              <w:rPr>
+                <w:rFonts w:ascii="Arial" w:cs="Arial" w:eastAsia="Arial" w:hAnsi="Arial"/>
+                <w:b w:val="0"/>
+                <w:color w:val="000000"/>
+                <w:sz w:val="19"/>
+                <w:szCs w:val="19"/>
+              </w:rPr>
+              <w:t>0.002</w:t>
+            </w:r>
+          </w:p>
+        </w:tc>
+        <w:tc>
+          <w:tcPr>
+            <w:tcW w:type="dxa" w:w="5200"/>
+            <w:tcMar>
+              <w:top w:type="dxa" w:w="60"/>
+              <w:left w:type="dxa" w:w="100"/>
+              <w:bottom w:type="dxa" w:w="60"/>
+              <w:right w:type="dxa" w:w="100"/>
+            </w:tcMar>
+          </w:tcPr>
+          <w:p>
+            <w:pPr>
+              <w:jc w:val="left"/>
+            </w:pPr>
+            <w:r>
+              <w:rPr>
+                <w:rFonts w:ascii="Arial" w:cs="Arial" w:eastAsia="Arial" w:hAnsi="Arial"/>
+                <w:b w:val="0"/>
+                <w:color w:val="000000"/>
+                <w:sz w:val="19"/>
+                <w:szCs w:val="19"/>
+              </w:rPr>
+              <w:t>0.000 – 0.524</w:t>
+            </w:r>
+          </w:p>
+        </w:tc>
+        <w:tc>
+          <w:tcPr>
+            <w:tcW w:type="dxa" w:w="1760"/>
+            <w:tcMar>
+              <w:top w:type="dxa" w:w="60"/>
+              <w:left w:type="dxa" w:w="100"/>
+              <w:bottom w:type="dxa" w:w="60"/>
+              <w:right w:type="dxa" w:w="100"/>
+            </w:tcMar>
+          </w:tcPr>
+          <w:p>
+            <w:pPr>
+              <w:jc w:val="left"/>
+            </w:pPr>
+            <w:r>
+              <w:rPr>
+                <w:rFonts w:ascii="Arial" w:cs="Arial" w:eastAsia="Arial" w:hAnsi="Arial"/>
+                <w:b w:val="0"/>
+                <w:color w:val="000000"/>
+                <w:sz w:val="19"/>
+                <w:szCs w:val="19"/>
+              </w:rPr>
+              <w:t>1 of 8</w:t>
+            </w:r>
+          </w:p>
+        </w:tc>
+      </w:tr>
+      <w:tr>
+        <w:trPr>
+          <w:tblHeader w:val="false"/>
+        </w:trPr>
+        <w:tc>
+          <w:tcPr>
+            <w:tcW w:type="dxa" w:w="700"/>
+            <w:tcMar>
+              <w:top w:type="dxa" w:w="60"/>
+              <w:left w:type="dxa" w:w="100"/>
+              <w:bottom w:type="dxa" w:w="60"/>
+              <w:right w:type="dxa" w:w="100"/>
+            </w:tcMar>
+          </w:tcPr>
+          <w:p>
+            <w:pPr>
+              <w:jc w:val="left"/>
+            </w:pPr>
+            <w:r>
+              <w:rPr>
+                <w:rFonts w:ascii="Arial" w:cs="Arial" w:eastAsia="Arial" w:hAnsi="Arial"/>
+                <w:b w:val="0"/>
+                <w:color w:val="000000"/>
+                <w:sz w:val="19"/>
+                <w:szCs w:val="19"/>
+              </w:rPr>
+              <w:t>ms_dom</w:t>
+            </w:r>
+          </w:p>
+        </w:tc>
+        <w:tc>
+          <w:tcPr>
+            <w:tcW w:type="dxa" w:w="1700"/>
+            <w:tcMar>
+              <w:top w:type="dxa" w:w="60"/>
+              <w:left w:type="dxa" w:w="100"/>
+              <w:bottom w:type="dxa" w:w="60"/>
+              <w:right w:type="dxa" w:w="100"/>
+            </w:tcMar>
+          </w:tcPr>
+          <w:p>
+            <w:pPr>
+              <w:jc w:val="left"/>
+            </w:pPr>
+            <w:r>
+              <w:rPr>
+                <w:rFonts w:ascii="Arial" w:cs="Arial" w:eastAsia="Arial" w:hAnsi="Arial"/>
+                <w:b w:val="0"/>
+                <w:color w:val="000000"/>
+                <w:sz w:val="19"/>
+                <w:szCs w:val="19"/>
+              </w:rPr>
+              <w:t>0.004</w:t>
+            </w:r>
+          </w:p>
+        </w:tc>
+        <w:tc>
+          <w:tcPr>
+            <w:tcW w:type="dxa" w:w="5200"/>
+            <w:tcMar>
+              <w:top w:type="dxa" w:w="60"/>
+              <w:left w:type="dxa" w:w="100"/>
+              <w:bottom w:type="dxa" w:w="60"/>
+              <w:right w:type="dxa" w:w="100"/>
+            </w:tcMar>
+          </w:tcPr>
+          <w:p>
+            <w:pPr>
+              <w:jc w:val="left"/>
+            </w:pPr>
+            <w:r>
+              <w:rPr>
+                <w:rFonts w:ascii="Arial" w:cs="Arial" w:eastAsia="Arial" w:hAnsi="Arial"/>
+                <w:b w:val="0"/>
+                <w:color w:val="000000"/>
+                <w:sz w:val="19"/>
+                <w:szCs w:val="19"/>
+              </w:rPr>
+              <w:t>0.000 – 0.084</w:t>
+            </w:r>
+          </w:p>
+        </w:tc>
+        <w:tc>
+          <w:tcPr>
+            <w:tcW w:type="dxa" w:w="1760"/>
+            <w:tcMar>
+              <w:top w:type="dxa" w:w="60"/>
+              <w:left w:type="dxa" w:w="100"/>
+              <w:bottom w:type="dxa" w:w="60"/>
+              <w:right w:type="dxa" w:w="100"/>
+            </w:tcMar>
+          </w:tcPr>
+          <w:p>
+            <w:pPr>
+              <w:jc w:val="left"/>
+            </w:pPr>
+            <w:r>
+              <w:rPr>
+                <w:rFonts w:ascii="Arial" w:cs="Arial" w:eastAsia="Arial" w:hAnsi="Arial"/>
+                <w:b w:val="0"/>
+                <w:color w:val="000000"/>
+                <w:sz w:val="19"/>
+                <w:szCs w:val="19"/>
+              </w:rPr>
+              <w:t>0 of 8</w:t>
+            </w:r>
+          </w:p>
+        </w:tc>
+      </w:tr>
+      <w:tr>
+        <w:trPr>
+          <w:tblHeader w:val="false"/>
+        </w:trPr>
+        <w:tc>
+          <w:tcPr>
+            <w:tcW w:type="dxa" w:w="700"/>
+            <w:tcMar>
+              <w:top w:type="dxa" w:w="60"/>
+              <w:left w:type="dxa" w:w="100"/>
+              <w:bottom w:type="dxa" w:w="60"/>
+              <w:right w:type="dxa" w:w="100"/>
+            </w:tcMar>
+          </w:tcPr>
+          <w:p>
+            <w:pPr>
+              <w:jc w:val="left"/>
+            </w:pPr>
+            <w:r>
+              <w:rPr>
+                <w:rFonts w:ascii="Arial" w:cs="Arial" w:eastAsia="Arial" w:hAnsi="Arial"/>
+                <w:b w:val="0"/>
+                <w:color w:val="000000"/>
+                <w:sz w:val="19"/>
+                <w:szCs w:val="19"/>
+              </w:rPr>
+              <w:t>balanced</w:t>
+            </w:r>
+          </w:p>
+        </w:tc>
+        <w:tc>
+          <w:tcPr>
+            <w:tcW w:type="dxa" w:w="1700"/>
+            <w:tcMar>
+              <w:top w:type="dxa" w:w="60"/>
+              <w:left w:type="dxa" w:w="100"/>
+              <w:bottom w:type="dxa" w:w="60"/>
+              <w:right w:type="dxa" w:w="100"/>
+            </w:tcMar>
+          </w:tcPr>
+          <w:p>
+            <w:pPr>
+              <w:jc w:val="left"/>
+            </w:pPr>
+            <w:r>
+              <w:rPr>
+                <w:rFonts w:ascii="Arial" w:cs="Arial" w:eastAsia="Arial" w:hAnsi="Arial"/>
+                <w:b w:val="0"/>
+                <w:color w:val="000000"/>
+                <w:sz w:val="19"/>
+                <w:szCs w:val="19"/>
+              </w:rPr>
+              <w:t>0.007</w:t>
+            </w:r>
+          </w:p>
+        </w:tc>
+        <w:tc>
+          <w:tcPr>
+            <w:tcW w:type="dxa" w:w="5200"/>
+            <w:tcMar>
+              <w:top w:type="dxa" w:w="60"/>
+              <w:left w:type="dxa" w:w="100"/>
+              <w:bottom w:type="dxa" w:w="60"/>
+              <w:right w:type="dxa" w:w="100"/>
+            </w:tcMar>
+          </w:tcPr>
+          <w:p>
+            <w:pPr>
+              <w:jc w:val="left"/>
+            </w:pPr>
+            <w:r>
+              <w:rPr>
+                <w:rFonts w:ascii="Arial" w:cs="Arial" w:eastAsia="Arial" w:hAnsi="Arial"/>
+                <w:b w:val="0"/>
+                <w:color w:val="000000"/>
+                <w:sz w:val="19"/>
+                <w:szCs w:val="19"/>
+              </w:rPr>
+              <w:t>0.000 – 0.048</w:t>
+            </w:r>
+          </w:p>
+        </w:tc>
+        <w:tc>
+          <w:tcPr>
+            <w:tcW w:type="dxa" w:w="1760"/>
+            <w:tcMar>
+              <w:top w:type="dxa" w:w="60"/>
+              <w:left w:type="dxa" w:w="100"/>
+              <w:bottom w:type="dxa" w:w="60"/>
+              <w:right w:type="dxa" w:w="100"/>
+            </w:tcMar>
+          </w:tcPr>
+          <w:p>
+            <w:pPr>
+              <w:jc w:val="left"/>
+            </w:pPr>
+            <w:r>
+              <w:rPr>
+                <w:rFonts w:ascii="Arial" w:cs="Arial" w:eastAsia="Arial" w:hAnsi="Arial"/>
+                <w:b w:val="0"/>
+                <w:color w:val="000000"/>
+                <w:sz w:val="19"/>
+                <w:szCs w:val="19"/>
+              </w:rPr>
+              <w:t>0 of 8</w:t>
+            </w:r>
+          </w:p>
+        </w:tc>
+      </w:tr>
+      <w:tr>
+        <w:trPr>
+          <w:tblHeader w:val="false"/>
+        </w:trPr>
+        <w:tc>
+          <w:tcPr>
+            <w:tcW w:type="dxa" w:w="700"/>
+            <w:tcMar>
+              <w:top w:type="dxa" w:w="60"/>
+              <w:left w:type="dxa" w:w="100"/>
+              <w:bottom w:type="dxa" w:w="60"/>
+              <w:right w:type="dxa" w:w="100"/>
+            </w:tcMar>
+          </w:tcPr>
+          <w:p>
+            <w:pPr>
+              <w:jc w:val="left"/>
+            </w:pPr>
+            <w:r>
+              <w:rPr>
+                <w:rFonts w:ascii="Arial" w:cs="Arial" w:eastAsia="Arial" w:hAnsi="Arial"/>
+                <w:b w:val="0"/>
+                <w:color w:val="000000"/>
+                <w:sz w:val="19"/>
+                <w:szCs w:val="19"/>
+              </w:rPr>
+              <w:t>entity</w:t>
+            </w:r>
+          </w:p>
+        </w:tc>
+        <w:tc>
+          <w:tcPr>
+            <w:tcW w:type="dxa" w:w="1700"/>
+            <w:tcMar>
+              <w:top w:type="dxa" w:w="60"/>
+              <w:left w:type="dxa" w:w="100"/>
+              <w:bottom w:type="dxa" w:w="60"/>
+              <w:right w:type="dxa" w:w="100"/>
+            </w:tcMar>
+          </w:tcPr>
+          <w:p>
+            <w:pPr>
+              <w:jc w:val="left"/>
+            </w:pPr>
+            <w:r>
+              <w:rPr>
+                <w:rFonts w:ascii="Arial" w:cs="Arial" w:eastAsia="Arial" w:hAnsi="Arial"/>
+                <w:b w:val="0"/>
+                <w:color w:val="000000"/>
+                <w:sz w:val="19"/>
+                <w:szCs w:val="19"/>
+              </w:rPr>
+              <w:t>0.005</w:t>
+            </w:r>
+          </w:p>
+        </w:tc>
+        <w:tc>
+          <w:tcPr>
+            <w:tcW w:type="dxa" w:w="5200"/>
+            <w:tcMar>
+              <w:top w:type="dxa" w:w="60"/>
+              <w:left w:type="dxa" w:w="100"/>
+              <w:bottom w:type="dxa" w:w="60"/>
+              <w:right w:type="dxa" w:w="100"/>
+            </w:tcMar>
+          </w:tcPr>
+          <w:p>
+            <w:pPr>
+              <w:jc w:val="left"/>
+            </w:pPr>
+            <w:r>
+              <w:rPr>
+                <w:rFonts w:ascii="Arial" w:cs="Arial" w:eastAsia="Arial" w:hAnsi="Arial"/>
+                <w:b w:val="0"/>
+                <w:color w:val="000000"/>
+                <w:sz w:val="19"/>
+                <w:szCs w:val="19"/>
+              </w:rPr>
+              <w:t>0.000 – 0.027</w:t>
+            </w:r>
+          </w:p>
+        </w:tc>
+        <w:tc>
+          <w:tcPr>
+            <w:tcW w:type="dxa" w:w="1760"/>
+            <w:tcMar>
+              <w:top w:type="dxa" w:w="60"/>
+              <w:left w:type="dxa" w:w="100"/>
+              <w:bottom w:type="dxa" w:w="60"/>
+              <w:right w:type="dxa" w:w="100"/>
+            </w:tcMar>
+          </w:tcPr>
+          <w:p>
+            <w:pPr>
+              <w:jc w:val="left"/>
+            </w:pPr>
+            <w:r>
+              <w:rPr>
+                <w:rFonts w:ascii="Arial" w:cs="Arial" w:eastAsia="Arial" w:hAnsi="Arial"/>
+                <w:b w:val="0"/>
+                <w:color w:val="000000"/>
+                <w:sz w:val="19"/>
+                <w:szCs w:val="19"/>
+              </w:rPr>
+              <w:t>0 of 8</w:t>
+            </w:r>
+          </w:p>
+        </w:tc>
+      </w:tr>
+    </w:tbl>
+    <w:p>
+      <w:pPr>
+        <w:spacing w:after="200" w:before="80"/>
+        <w:jc w:val="center"/>
+      </w:pPr>
+      <w:r>
+        <w:rPr>
+          <w:b w:val="0"/>
+        </w:rPr>
+        <w:t>Table 5: English probability assigned by the vanilla Whisper detector, by switch type. Threshold for selecting English is 0.5.</w:t>
+      </w:r>
+    </w:p>
+    <w:p>
+      <w:pPr>
+        <w:spacing w:after="120" w:line="300"/>
+      </w:pPr>
+      <w:r>
+        <w:rPr>
+          <w:b w:val="0"/>
+        </w:rPr>
+        <w:t>The detector is not deaf to the English; it is under-confident about it. Every en_dom clip receives a non-trivial English probability (minimum 0.067), but the category median is 0.234 — less than half the threshold. These utterances are English matrix sentences carrying Malay discourse particles by design, so the detector sees a mixture and hedges. A cutoff of 0.5 is a reasonable default for monolingual audio and is simply the wrong scale for code-switched audio.</w:t>
+      </w:r>
+    </w:p>
+    <w:p>
+      <w:pPr>
+        <w:spacing w:after="120" w:line="300"/>
+      </w:pPr>
+      <w:r>
+        <w:rPr>
+          <w:b w:val="0"/>
+        </w:rPr>
+        <w:t>The distributions nevertheless overlap, so no cutoff separates the categories cleanly. en_dom spans 0.067 to 0.671, while one numeric clip reaches 0.524 and one particles clip 0.466. Any threshold low enough to capture all eight English-dominant clips also captures clips from categories where English is the wrong choice. Routing on this signal has a floor that is a property of the detector, not of the constant.</w:t>
+      </w:r>
+    </w:p>
+    <w:p>
+      <w:pPr>
+        <w:spacing w:after="120" w:line="300"/>
+      </w:pPr>
+      <w:r>
+        <w:rPr>
+          <w:b w:val="0"/>
+        </w:rPr>
+        <w:t>Sensitivity was measured without re-transcribing anything. Routing selects between two language tokens, and both branches already exist for every clip as the malaysian_prompt and malaysian_prompt_en configurations, so the routed transcript at any threshold is a selection over cached text. The procedure reconstructs the measured 0.349 exactly at the threshold in use, which is what establishes that the reconstruction is faithful before any other row is read.</w:t>
+      </w:r>
+    </w:p>
+    <w:tbl>
+      <w:tblPr>
+        <w:tblW w:type="dxa" w:w="9360"/>
+        <w:tblBorders>
+          <w:top w:val="single" w:color="auto" w:sz="4"/>
+          <w:left w:val="single" w:color="auto" w:sz="4"/>
+          <w:bottom w:val="single" w:color="auto" w:sz="4"/>
+          <w:right w:val="single" w:color="auto" w:sz="4"/>
+          <w:insideH w:val="single" w:color="auto" w:sz="4"/>
+          <w:insideV w:val="single" w:color="auto" w:sz="4"/>
+        </w:tblBorders>
+      </w:tblPr>
+      <w:tblGrid>
+        <w:gridCol w:w="700"/>
+        <w:gridCol w:w="1700"/>
+        <w:gridCol w:w="5200"/>
+        <w:gridCol w:w="1760"/>
+      </w:tblGrid>
+      <w:tr>
+        <w:trPr>
+          <w:tblHeader/>
+        </w:trPr>
+        <w:tc>
+          <w:tcPr>
+            <w:tcW w:type="dxa" w:w="700"/>
+            <w:shd w:fill="1F3864" w:val="clear"/>
+            <w:tcMar>
+              <w:top w:type="dxa" w:w="60"/>
+              <w:left w:type="dxa" w:w="100"/>
+              <w:bottom w:type="dxa" w:w="60"/>
+              <w:right w:type="dxa" w:w="100"/>
+            </w:tcMar>
+          </w:tcPr>
+          <w:p>
+            <w:pPr>
+              <w:jc w:val="left"/>
+            </w:pPr>
+            <w:r>
+              <w:rPr>
+                <w:rFonts w:ascii="Arial" w:cs="Arial" w:eastAsia="Arial" w:hAnsi="Arial"/>
+                <w:b/>
+                <w:bCs/>
+                <w:color w:val="FFFFFF"/>
+                <w:sz w:val="19"/>
+                <w:szCs w:val="19"/>
+              </w:rPr>
+              <w:t>Threshold</w:t>
+            </w:r>
+          </w:p>
+        </w:tc>
+        <w:tc>
+          <w:tcPr>
+            <w:tcW w:type="dxa" w:w="1700"/>
+            <w:shd w:fill="1F3864" w:val="clear"/>
+            <w:tcMar>
+              <w:top w:type="dxa" w:w="60"/>
+              <w:left w:type="dxa" w:w="100"/>
+              <w:bottom w:type="dxa" w:w="60"/>
+              <w:right w:type="dxa" w:w="100"/>
+            </w:tcMar>
+          </w:tcPr>
+          <w:p>
+            <w:pPr>
+              <w:jc w:val="left"/>
+            </w:pPr>
+            <w:r>
+              <w:rPr>
+                <w:rFonts w:ascii="Arial" w:cs="Arial" w:eastAsia="Arial" w:hAnsi="Arial"/>
+                <w:b/>
+                <w:bCs/>
+                <w:color w:val="FFFFFF"/>
+                <w:sz w:val="19"/>
+                <w:szCs w:val="19"/>
+              </w:rPr>
+              <w:t>Clips routed to English</w:t>
+            </w:r>
+          </w:p>
+        </w:tc>
+        <w:tc>
+          <w:tcPr>
+            <w:tcW w:type="dxa" w:w="5200"/>
+            <w:shd w:fill="1F3864" w:val="clear"/>
+            <w:tcMar>
+              <w:top w:type="dxa" w:w="60"/>
+              <w:left w:type="dxa" w:w="100"/>
+              <w:bottom w:type="dxa" w:w="60"/>
+              <w:right w:type="dxa" w:w="100"/>
+            </w:tcMar>
+          </w:tcPr>
+          <w:p>
+            <w:pPr>
+              <w:jc w:val="left"/>
+            </w:pPr>
+            <w:r>
+              <w:rPr>
+                <w:rFonts w:ascii="Arial" w:cs="Arial" w:eastAsia="Arial" w:hAnsi="Arial"/>
+                <w:b/>
+                <w:bCs/>
+                <w:color w:val="FFFFFF"/>
+                <w:sz w:val="19"/>
+                <w:szCs w:val="19"/>
+              </w:rPr>
+              <w:t>WER (strict)</w:t>
+            </w:r>
+          </w:p>
+        </w:tc>
+        <w:tc>
+          <w:tcPr>
+            <w:tcW w:type="dxa" w:w="1760"/>
+            <w:shd w:fill="1F3864" w:val="clear"/>
+            <w:tcMar>
+              <w:top w:type="dxa" w:w="60"/>
+              <w:left w:type="dxa" w:w="100"/>
+              <w:bottom w:type="dxa" w:w="60"/>
+              <w:right w:type="dxa" w:w="100"/>
+            </w:tcMar>
+          </w:tcPr>
+          <w:p>
+            <w:pPr>
+              <w:jc w:val="left"/>
+            </w:pPr>
+            <w:r>
+              <w:rPr>
+                <w:rFonts w:ascii="Arial" w:cs="Arial" w:eastAsia="Arial" w:hAnsi="Arial"/>
+                <w:b/>
+                <w:bCs/>
+                <w:color w:val="FFFFFF"/>
+                <w:sz w:val="19"/>
+                <w:szCs w:val="19"/>
+              </w:rPr>
+              <w:t>WER (lenient)</w:t>
+            </w:r>
+          </w:p>
+        </w:tc>
+      </w:tr>
+      <w:tr>
+        <w:trPr>
+          <w:tblHeader w:val="false"/>
+        </w:trPr>
+        <w:tc>
+          <w:tcPr>
+            <w:tcW w:type="dxa" w:w="700"/>
+            <w:tcMar>
+              <w:top w:type="dxa" w:w="60"/>
+              <w:left w:type="dxa" w:w="100"/>
+              <w:bottom w:type="dxa" w:w="60"/>
+              <w:right w:type="dxa" w:w="100"/>
+            </w:tcMar>
+          </w:tcPr>
+          <w:p>
+            <w:pPr>
+              <w:jc w:val="left"/>
+            </w:pPr>
+            <w:r>
+              <w:rPr>
+                <w:rFonts w:ascii="Arial" w:cs="Arial" w:eastAsia="Arial" w:hAnsi="Arial"/>
+                <w:b w:val="0"/>
+                <w:color w:val="000000"/>
+                <w:sz w:val="19"/>
+                <w:szCs w:val="19"/>
+              </w:rPr>
+              <w:t>0.00</w:t>
+            </w:r>
+          </w:p>
+        </w:tc>
+        <w:tc>
+          <w:tcPr>
+            <w:tcW w:type="dxa" w:w="1700"/>
+            <w:tcMar>
+              <w:top w:type="dxa" w:w="60"/>
+              <w:left w:type="dxa" w:w="100"/>
+              <w:bottom w:type="dxa" w:w="60"/>
+              <w:right w:type="dxa" w:w="100"/>
+            </w:tcMar>
+          </w:tcPr>
+          <w:p>
+            <w:pPr>
+              <w:jc w:val="left"/>
+            </w:pPr>
+            <w:r>
+              <w:rPr>
+                <w:rFonts w:ascii="Arial" w:cs="Arial" w:eastAsia="Arial" w:hAnsi="Arial"/>
+                <w:b w:val="0"/>
+                <w:color w:val="000000"/>
+                <w:sz w:val="19"/>
+                <w:szCs w:val="19"/>
+              </w:rPr>
+              <w:t>48</w:t>
+            </w:r>
+          </w:p>
+        </w:tc>
+        <w:tc>
+          <w:tcPr>
+            <w:tcW w:type="dxa" w:w="5200"/>
+            <w:tcMar>
+              <w:top w:type="dxa" w:w="60"/>
+              <w:left w:type="dxa" w:w="100"/>
+              <w:bottom w:type="dxa" w:w="60"/>
+              <w:right w:type="dxa" w:w="100"/>
+            </w:tcMar>
+          </w:tcPr>
+          <w:p>
+            <w:pPr>
+              <w:jc w:val="left"/>
+            </w:pPr>
+            <w:r>
+              <w:rPr>
+                <w:rFonts w:ascii="Arial" w:cs="Arial" w:eastAsia="Arial" w:hAnsi="Arial"/>
+                <w:b w:val="0"/>
+                <w:color w:val="000000"/>
+                <w:sz w:val="19"/>
+                <w:szCs w:val="19"/>
+              </w:rPr>
+              <w:t>1.2739</w:t>
+            </w:r>
+          </w:p>
+        </w:tc>
+        <w:tc>
+          <w:tcPr>
+            <w:tcW w:type="dxa" w:w="1760"/>
+            <w:tcMar>
+              <w:top w:type="dxa" w:w="60"/>
+              <w:left w:type="dxa" w:w="100"/>
+              <w:bottom w:type="dxa" w:w="60"/>
+              <w:right w:type="dxa" w:w="100"/>
+            </w:tcMar>
+          </w:tcPr>
+          <w:p>
+            <w:pPr>
+              <w:jc w:val="left"/>
+            </w:pPr>
+            <w:r>
+              <w:rPr>
+                <w:rFonts w:ascii="Arial" w:cs="Arial" w:eastAsia="Arial" w:hAnsi="Arial"/>
+                <w:b w:val="0"/>
+                <w:color w:val="000000"/>
+                <w:sz w:val="19"/>
+                <w:szCs w:val="19"/>
+              </w:rPr>
+              <w:t>1.2636</w:t>
+            </w:r>
+          </w:p>
+        </w:tc>
+      </w:tr>
+      <w:tr>
+        <w:trPr>
+          <w:tblHeader w:val="false"/>
+        </w:trPr>
+        <w:tc>
+          <w:tcPr>
+            <w:tcW w:type="dxa" w:w="700"/>
+            <w:tcMar>
+              <w:top w:type="dxa" w:w="60"/>
+              <w:left w:type="dxa" w:w="100"/>
+              <w:bottom w:type="dxa" w:w="60"/>
+              <w:right w:type="dxa" w:w="100"/>
+            </w:tcMar>
+          </w:tcPr>
+          <w:p>
+            <w:pPr>
+              <w:jc w:val="left"/>
+            </w:pPr>
+            <w:r>
+              <w:rPr>
+                <w:rFonts w:ascii="Arial" w:cs="Arial" w:eastAsia="Arial" w:hAnsi="Arial"/>
+                <w:b w:val="0"/>
+                <w:color w:val="000000"/>
+                <w:sz w:val="19"/>
+                <w:szCs w:val="19"/>
+              </w:rPr>
+              <w:t>0.05</w:t>
+            </w:r>
+          </w:p>
+        </w:tc>
+        <w:tc>
+          <w:tcPr>
+            <w:tcW w:type="dxa" w:w="1700"/>
+            <w:tcMar>
+              <w:top w:type="dxa" w:w="60"/>
+              <w:left w:type="dxa" w:w="100"/>
+              <w:bottom w:type="dxa" w:w="60"/>
+              <w:right w:type="dxa" w:w="100"/>
+            </w:tcMar>
+          </w:tcPr>
+          <w:p>
+            <w:pPr>
+              <w:jc w:val="left"/>
+            </w:pPr>
+            <w:r>
+              <w:rPr>
+                <w:rFonts w:ascii="Arial" w:cs="Arial" w:eastAsia="Arial" w:hAnsi="Arial"/>
+                <w:b w:val="0"/>
+                <w:color w:val="000000"/>
+                <w:sz w:val="19"/>
+                <w:szCs w:val="19"/>
+              </w:rPr>
+              <w:t>12</w:t>
+            </w:r>
+          </w:p>
+        </w:tc>
+        <w:tc>
+          <w:tcPr>
+            <w:tcW w:type="dxa" w:w="5200"/>
+            <w:tcMar>
+              <w:top w:type="dxa" w:w="60"/>
+              <w:left w:type="dxa" w:w="100"/>
+              <w:bottom w:type="dxa" w:w="60"/>
+              <w:right w:type="dxa" w:w="100"/>
+            </w:tcMar>
+          </w:tcPr>
+          <w:p>
+            <w:pPr>
+              <w:jc w:val="left"/>
+            </w:pPr>
+            <w:r>
+              <w:rPr>
+                <w:rFonts w:ascii="Arial" w:cs="Arial" w:eastAsia="Arial" w:hAnsi="Arial"/>
+                <w:b w:val="0"/>
+                <w:color w:val="000000"/>
+                <w:sz w:val="19"/>
+                <w:szCs w:val="19"/>
+              </w:rPr>
+              <w:t>0.2765</w:t>
+            </w:r>
+          </w:p>
+        </w:tc>
+        <w:tc>
+          <w:tcPr>
+            <w:tcW w:type="dxa" w:w="1760"/>
+            <w:tcMar>
+              <w:top w:type="dxa" w:w="60"/>
+              <w:left w:type="dxa" w:w="100"/>
+              <w:bottom w:type="dxa" w:w="60"/>
+              <w:right w:type="dxa" w:w="100"/>
+            </w:tcMar>
+          </w:tcPr>
+          <w:p>
+            <w:pPr>
+              <w:jc w:val="left"/>
+            </w:pPr>
+            <w:r>
+              <w:rPr>
+                <w:rFonts w:ascii="Arial" w:cs="Arial" w:eastAsia="Arial" w:hAnsi="Arial"/>
+                <w:b w:val="0"/>
+                <w:color w:val="000000"/>
+                <w:sz w:val="19"/>
+                <w:szCs w:val="19"/>
+              </w:rPr>
+              <w:t>0.2661</w:t>
+            </w:r>
+          </w:p>
+        </w:tc>
+      </w:tr>
+      <w:tr>
+        <w:trPr>
+          <w:tblHeader w:val="false"/>
+        </w:trPr>
+        <w:tc>
+          <w:tcPr>
+            <w:tcW w:type="dxa" w:w="700"/>
+            <w:tcMar>
+              <w:top w:type="dxa" w:w="60"/>
+              <w:left w:type="dxa" w:w="100"/>
+              <w:bottom w:type="dxa" w:w="60"/>
+              <w:right w:type="dxa" w:w="100"/>
+            </w:tcMar>
+          </w:tcPr>
+          <w:p>
+            <w:pPr>
+              <w:jc w:val="left"/>
+            </w:pPr>
+            <w:r>
+              <w:rPr>
+                <w:rFonts w:ascii="Arial" w:cs="Arial" w:eastAsia="Arial" w:hAnsi="Arial"/>
+                <w:b w:val="0"/>
+                <w:color w:val="000000"/>
+                <w:sz w:val="19"/>
+                <w:szCs w:val="19"/>
+              </w:rPr>
+              <w:t>0.10</w:t>
+            </w:r>
+          </w:p>
+        </w:tc>
+        <w:tc>
+          <w:tcPr>
+            <w:tcW w:type="dxa" w:w="1700"/>
+            <w:tcMar>
+              <w:top w:type="dxa" w:w="60"/>
+              <w:left w:type="dxa" w:w="100"/>
+              <w:bottom w:type="dxa" w:w="60"/>
+              <w:right w:type="dxa" w:w="100"/>
+            </w:tcMar>
+          </w:tcPr>
+          <w:p>
+            <w:pPr>
+              <w:jc w:val="left"/>
+            </w:pPr>
+            <w:r>
+              <w:rPr>
+                <w:rFonts w:ascii="Arial" w:cs="Arial" w:eastAsia="Arial" w:hAnsi="Arial"/>
+                <w:b w:val="0"/>
+                <w:color w:val="000000"/>
+                <w:sz w:val="19"/>
+                <w:szCs w:val="19"/>
+              </w:rPr>
+              <w:t>9</w:t>
+            </w:r>
+          </w:p>
+        </w:tc>
+        <w:tc>
+          <w:tcPr>
+            <w:tcW w:type="dxa" w:w="5200"/>
+            <w:tcMar>
+              <w:top w:type="dxa" w:w="60"/>
+              <w:left w:type="dxa" w:w="100"/>
+              <w:bottom w:type="dxa" w:w="60"/>
+              <w:right w:type="dxa" w:w="100"/>
+            </w:tcMar>
+          </w:tcPr>
+          <w:p>
+            <w:pPr>
+              <w:jc w:val="left"/>
+            </w:pPr>
+            <w:r>
+              <w:rPr>
+                <w:rFonts w:ascii="Arial" w:cs="Arial" w:eastAsia="Arial" w:hAnsi="Arial"/>
+                <w:b w:val="0"/>
+                <w:color w:val="000000"/>
+                <w:sz w:val="19"/>
+                <w:szCs w:val="19"/>
+              </w:rPr>
+              <w:t>0.2997</w:t>
+            </w:r>
+          </w:p>
+        </w:tc>
+        <w:tc>
+          <w:tcPr>
+            <w:tcW w:type="dxa" w:w="1760"/>
+            <w:tcMar>
+              <w:top w:type="dxa" w:w="60"/>
+              <w:left w:type="dxa" w:w="100"/>
+              <w:bottom w:type="dxa" w:w="60"/>
+              <w:right w:type="dxa" w:w="100"/>
+            </w:tcMar>
+          </w:tcPr>
+          <w:p>
+            <w:pPr>
+              <w:jc w:val="left"/>
+            </w:pPr>
+            <w:r>
+              <w:rPr>
+                <w:rFonts w:ascii="Arial" w:cs="Arial" w:eastAsia="Arial" w:hAnsi="Arial"/>
+                <w:b w:val="0"/>
+                <w:color w:val="000000"/>
+                <w:sz w:val="19"/>
+                <w:szCs w:val="19"/>
+              </w:rPr>
+              <w:t>0.2894</w:t>
+            </w:r>
+          </w:p>
+        </w:tc>
+      </w:tr>
+      <w:tr>
+        <w:trPr>
+          <w:tblHeader w:val="false"/>
+        </w:trPr>
+        <w:tc>
+          <w:tcPr>
+            <w:tcW w:type="dxa" w:w="700"/>
+            <w:tcMar>
+              <w:top w:type="dxa" w:w="60"/>
+              <w:left w:type="dxa" w:w="100"/>
+              <w:bottom w:type="dxa" w:w="60"/>
+              <w:right w:type="dxa" w:w="100"/>
+            </w:tcMar>
+          </w:tcPr>
+          <w:p>
+            <w:pPr>
+              <w:jc w:val="left"/>
+            </w:pPr>
+            <w:r>
+              <w:rPr>
+                <w:rFonts w:ascii="Arial" w:cs="Arial" w:eastAsia="Arial" w:hAnsi="Arial"/>
+                <w:b w:val="0"/>
+                <w:color w:val="000000"/>
+                <w:sz w:val="19"/>
+                <w:szCs w:val="19"/>
+              </w:rPr>
+              <w:t>0.25</w:t>
+            </w:r>
+          </w:p>
+        </w:tc>
+        <w:tc>
+          <w:tcPr>
+            <w:tcW w:type="dxa" w:w="1700"/>
+            <w:tcMar>
+              <w:top w:type="dxa" w:w="60"/>
+              <w:left w:type="dxa" w:w="100"/>
+              <w:bottom w:type="dxa" w:w="60"/>
+              <w:right w:type="dxa" w:w="100"/>
+            </w:tcMar>
+          </w:tcPr>
+          <w:p>
+            <w:pPr>
+              <w:jc w:val="left"/>
+            </w:pPr>
+            <w:r>
+              <w:rPr>
+                <w:rFonts w:ascii="Arial" w:cs="Arial" w:eastAsia="Arial" w:hAnsi="Arial"/>
+                <w:b w:val="0"/>
+                <w:color w:val="000000"/>
+                <w:sz w:val="19"/>
+                <w:szCs w:val="19"/>
+              </w:rPr>
+              <w:t>6</w:t>
+            </w:r>
+          </w:p>
+        </w:tc>
+        <w:tc>
+          <w:tcPr>
+            <w:tcW w:type="dxa" w:w="5200"/>
+            <w:tcMar>
+              <w:top w:type="dxa" w:w="60"/>
+              <w:left w:type="dxa" w:w="100"/>
+              <w:bottom w:type="dxa" w:w="60"/>
+              <w:right w:type="dxa" w:w="100"/>
+            </w:tcMar>
+          </w:tcPr>
+          <w:p>
+            <w:pPr>
+              <w:jc w:val="left"/>
+            </w:pPr>
+            <w:r>
+              <w:rPr>
+                <w:rFonts w:ascii="Arial" w:cs="Arial" w:eastAsia="Arial" w:hAnsi="Arial"/>
+                <w:b w:val="0"/>
+                <w:color w:val="000000"/>
+                <w:sz w:val="19"/>
+                <w:szCs w:val="19"/>
+              </w:rPr>
+              <w:t>0.3256</w:t>
+            </w:r>
+          </w:p>
+        </w:tc>
+        <w:tc>
+          <w:tcPr>
+            <w:tcW w:type="dxa" w:w="1760"/>
+            <w:tcMar>
+              <w:top w:type="dxa" w:w="60"/>
+              <w:left w:type="dxa" w:w="100"/>
+              <w:bottom w:type="dxa" w:w="60"/>
+              <w:right w:type="dxa" w:w="100"/>
+            </w:tcMar>
+          </w:tcPr>
+          <w:p>
+            <w:pPr>
+              <w:jc w:val="left"/>
+            </w:pPr>
+            <w:r>
+              <w:rPr>
+                <w:rFonts w:ascii="Arial" w:cs="Arial" w:eastAsia="Arial" w:hAnsi="Arial"/>
+                <w:b w:val="0"/>
+                <w:color w:val="000000"/>
+                <w:sz w:val="19"/>
+                <w:szCs w:val="19"/>
+              </w:rPr>
+              <w:t>0.3152</w:t>
+            </w:r>
+          </w:p>
+        </w:tc>
+      </w:tr>
+      <w:tr>
+        <w:trPr>
+          <w:tblHeader w:val="false"/>
+        </w:trPr>
+        <w:tc>
+          <w:tcPr>
+            <w:tcW w:type="dxa" w:w="700"/>
+            <w:tcMar>
+              <w:top w:type="dxa" w:w="60"/>
+              <w:left w:type="dxa" w:w="100"/>
+              <w:bottom w:type="dxa" w:w="60"/>
+              <w:right w:type="dxa" w:w="100"/>
+            </w:tcMar>
+          </w:tcPr>
+          <w:p>
+            <w:pPr>
+              <w:jc w:val="left"/>
+            </w:pPr>
+            <w:r>
+              <w:rPr>
+                <w:rFonts w:ascii="Arial" w:cs="Arial" w:eastAsia="Arial" w:hAnsi="Arial"/>
+                <w:b w:val="0"/>
+                <w:color w:val="000000"/>
+                <w:sz w:val="19"/>
+                <w:szCs w:val="19"/>
+              </w:rPr>
+              <w:t>0.30</w:t>
+            </w:r>
+          </w:p>
+        </w:tc>
+        <w:tc>
+          <w:tcPr>
+            <w:tcW w:type="dxa" w:w="1700"/>
+            <w:tcMar>
+              <w:top w:type="dxa" w:w="60"/>
+              <w:left w:type="dxa" w:w="100"/>
+              <w:bottom w:type="dxa" w:w="60"/>
+              <w:right w:type="dxa" w:w="100"/>
+            </w:tcMar>
+          </w:tcPr>
+          <w:p>
+            <w:pPr>
+              <w:jc w:val="left"/>
+            </w:pPr>
+            <w:r>
+              <w:rPr>
+                <w:rFonts w:ascii="Arial" w:cs="Arial" w:eastAsia="Arial" w:hAnsi="Arial"/>
+                <w:b w:val="0"/>
+                <w:color w:val="000000"/>
+                <w:sz w:val="19"/>
+                <w:szCs w:val="19"/>
+              </w:rPr>
+              <w:t>5</w:t>
+            </w:r>
+          </w:p>
+        </w:tc>
+        <w:tc>
+          <w:tcPr>
+            <w:tcW w:type="dxa" w:w="5200"/>
+            <w:tcMar>
+              <w:top w:type="dxa" w:w="60"/>
+              <w:left w:type="dxa" w:w="100"/>
+              <w:bottom w:type="dxa" w:w="60"/>
+              <w:right w:type="dxa" w:w="100"/>
+            </w:tcMar>
+          </w:tcPr>
+          <w:p>
+            <w:pPr>
+              <w:jc w:val="left"/>
+            </w:pPr>
+            <w:r>
+              <w:rPr>
+                <w:rFonts w:ascii="Arial" w:cs="Arial" w:eastAsia="Arial" w:hAnsi="Arial"/>
+                <w:b w:val="0"/>
+                <w:color w:val="000000"/>
+                <w:sz w:val="19"/>
+                <w:szCs w:val="19"/>
+              </w:rPr>
+              <w:t>0.3488</w:t>
+            </w:r>
+          </w:p>
+        </w:tc>
+        <w:tc>
+          <w:tcPr>
+            <w:tcW w:type="dxa" w:w="1760"/>
+            <w:tcMar>
+              <w:top w:type="dxa" w:w="60"/>
+              <w:left w:type="dxa" w:w="100"/>
+              <w:bottom w:type="dxa" w:w="60"/>
+              <w:right w:type="dxa" w:w="100"/>
+            </w:tcMar>
+          </w:tcPr>
+          <w:p>
+            <w:pPr>
+              <w:jc w:val="left"/>
+            </w:pPr>
+            <w:r>
+              <w:rPr>
+                <w:rFonts w:ascii="Arial" w:cs="Arial" w:eastAsia="Arial" w:hAnsi="Arial"/>
+                <w:b w:val="0"/>
+                <w:color w:val="000000"/>
+                <w:sz w:val="19"/>
+                <w:szCs w:val="19"/>
+              </w:rPr>
+              <w:t>0.3385</w:t>
+            </w:r>
+          </w:p>
+        </w:tc>
+      </w:tr>
+      <w:tr>
+        <w:trPr>
+          <w:tblHeader w:val="false"/>
+        </w:trPr>
+        <w:tc>
+          <w:tcPr>
+            <w:tcW w:type="dxa" w:w="700"/>
+            <w:tcMar>
+              <w:top w:type="dxa" w:w="60"/>
+              <w:left w:type="dxa" w:w="100"/>
+              <w:bottom w:type="dxa" w:w="60"/>
+              <w:right w:type="dxa" w:w="100"/>
+            </w:tcMar>
+          </w:tcPr>
+          <w:p>
+            <w:pPr>
+              <w:jc w:val="left"/>
+            </w:pPr>
+            <w:r>
+              <w:rPr>
+                <w:rFonts w:ascii="Arial" w:cs="Arial" w:eastAsia="Arial" w:hAnsi="Arial"/>
+                <w:b w:val="0"/>
+                <w:color w:val="000000"/>
+                <w:sz w:val="19"/>
+                <w:szCs w:val="19"/>
+              </w:rPr>
+              <w:t>0.55</w:t>
+            </w:r>
+          </w:p>
+        </w:tc>
+        <w:tc>
+          <w:tcPr>
+            <w:tcW w:type="dxa" w:w="1700"/>
+            <w:tcMar>
+              <w:top w:type="dxa" w:w="60"/>
+              <w:left w:type="dxa" w:w="100"/>
+              <w:bottom w:type="dxa" w:w="60"/>
+              <w:right w:type="dxa" w:w="100"/>
+            </w:tcMar>
+          </w:tcPr>
+          <w:p>
+            <w:pPr>
+              <w:jc w:val="left"/>
+            </w:pPr>
+            <w:r>
+              <w:rPr>
+                <w:rFonts w:ascii="Arial" w:cs="Arial" w:eastAsia="Arial" w:hAnsi="Arial"/>
+                <w:b w:val="0"/>
+                <w:color w:val="000000"/>
+                <w:sz w:val="19"/>
+                <w:szCs w:val="19"/>
+              </w:rPr>
+              <w:t>3</w:t>
+            </w:r>
+          </w:p>
+        </w:tc>
+        <w:tc>
+          <w:tcPr>
+            <w:tcW w:type="dxa" w:w="5200"/>
+            <w:tcMar>
+              <w:top w:type="dxa" w:w="60"/>
+              <w:left w:type="dxa" w:w="100"/>
+              <w:bottom w:type="dxa" w:w="60"/>
+              <w:right w:type="dxa" w:w="100"/>
+            </w:tcMar>
+          </w:tcPr>
+          <w:p>
+            <w:pPr>
+              <w:jc w:val="left"/>
+            </w:pPr>
+            <w:r>
+              <w:rPr>
+                <w:rFonts w:ascii="Arial" w:cs="Arial" w:eastAsia="Arial" w:hAnsi="Arial"/>
+                <w:b w:val="0"/>
+                <w:color w:val="000000"/>
+                <w:sz w:val="19"/>
+                <w:szCs w:val="19"/>
+              </w:rPr>
+              <w:t>0.3540</w:t>
+            </w:r>
+          </w:p>
+        </w:tc>
+        <w:tc>
+          <w:tcPr>
+            <w:tcW w:type="dxa" w:w="1760"/>
+            <w:tcMar>
+              <w:top w:type="dxa" w:w="60"/>
+              <w:left w:type="dxa" w:w="100"/>
+              <w:bottom w:type="dxa" w:w="60"/>
+              <w:right w:type="dxa" w:w="100"/>
+            </w:tcMar>
+          </w:tcPr>
+          <w:p>
+            <w:pPr>
+              <w:jc w:val="left"/>
+            </w:pPr>
+            <w:r>
+              <w:rPr>
+                <w:rFonts w:ascii="Arial" w:cs="Arial" w:eastAsia="Arial" w:hAnsi="Arial"/>
+                <w:b w:val="0"/>
+                <w:color w:val="000000"/>
+                <w:sz w:val="19"/>
+                <w:szCs w:val="19"/>
+              </w:rPr>
+              <w:t>0.3437</w:t>
+            </w:r>
+          </w:p>
+        </w:tc>
+      </w:tr>
+      <w:tr>
+        <w:trPr>
+          <w:tblHeader w:val="false"/>
+        </w:trPr>
+        <w:tc>
+          <w:tcPr>
+            <w:tcW w:type="dxa" w:w="700"/>
+            <w:tcMar>
+              <w:top w:type="dxa" w:w="60"/>
+              <w:left w:type="dxa" w:w="100"/>
+              <w:bottom w:type="dxa" w:w="60"/>
+              <w:right w:type="dxa" w:w="100"/>
+            </w:tcMar>
+          </w:tcPr>
+          <w:p>
+            <w:pPr>
+              <w:jc w:val="left"/>
+            </w:pPr>
+            <w:r>
+              <w:rPr>
+                <w:rFonts w:ascii="Arial" w:cs="Arial" w:eastAsia="Arial" w:hAnsi="Arial"/>
+                <w:b w:val="0"/>
+                <w:color w:val="000000"/>
+                <w:sz w:val="19"/>
+                <w:szCs w:val="19"/>
+              </w:rPr>
+              <w:t>0.60</w:t>
+            </w:r>
+          </w:p>
+        </w:tc>
+        <w:tc>
+          <w:tcPr>
+            <w:tcW w:type="dxa" w:w="1700"/>
+            <w:tcMar>
+              <w:top w:type="dxa" w:w="60"/>
+              <w:left w:type="dxa" w:w="100"/>
+              <w:bottom w:type="dxa" w:w="60"/>
+              <w:right w:type="dxa" w:w="100"/>
+            </w:tcMar>
+          </w:tcPr>
+          <w:p>
+            <w:pPr>
+              <w:jc w:val="left"/>
+            </w:pPr>
+            <w:r>
+              <w:rPr>
+                <w:rFonts w:ascii="Arial" w:cs="Arial" w:eastAsia="Arial" w:hAnsi="Arial"/>
+                <w:b w:val="0"/>
+                <w:color w:val="000000"/>
+                <w:sz w:val="19"/>
+                <w:szCs w:val="19"/>
+              </w:rPr>
+              <w:t>2</w:t>
+            </w:r>
+          </w:p>
+        </w:tc>
+        <w:tc>
+          <w:tcPr>
+            <w:tcW w:type="dxa" w:w="5200"/>
+            <w:tcMar>
+              <w:top w:type="dxa" w:w="60"/>
+              <w:left w:type="dxa" w:w="100"/>
+              <w:bottom w:type="dxa" w:w="60"/>
+              <w:right w:type="dxa" w:w="100"/>
+            </w:tcMar>
+          </w:tcPr>
+          <w:p>
+            <w:pPr>
+              <w:jc w:val="left"/>
+            </w:pPr>
+            <w:r>
+              <w:rPr>
+                <w:rFonts w:ascii="Arial" w:cs="Arial" w:eastAsia="Arial" w:hAnsi="Arial"/>
+                <w:b w:val="0"/>
+                <w:color w:val="000000"/>
+                <w:sz w:val="19"/>
+                <w:szCs w:val="19"/>
+              </w:rPr>
+              <w:t>0.3669</w:t>
+            </w:r>
+          </w:p>
+        </w:tc>
+        <w:tc>
+          <w:tcPr>
+            <w:tcW w:type="dxa" w:w="1760"/>
+            <w:tcMar>
+              <w:top w:type="dxa" w:w="60"/>
+              <w:left w:type="dxa" w:w="100"/>
+              <w:bottom w:type="dxa" w:w="60"/>
+              <w:right w:type="dxa" w:w="100"/>
+            </w:tcMar>
+          </w:tcPr>
+          <w:p>
+            <w:pPr>
+              <w:jc w:val="left"/>
+            </w:pPr>
+            <w:r>
+              <w:rPr>
+                <w:rFonts w:ascii="Arial" w:cs="Arial" w:eastAsia="Arial" w:hAnsi="Arial"/>
+                <w:b w:val="0"/>
+                <w:color w:val="000000"/>
+                <w:sz w:val="19"/>
+                <w:szCs w:val="19"/>
+              </w:rPr>
+              <w:t>0.3566</w:t>
+            </w:r>
+          </w:p>
+        </w:tc>
+      </w:tr>
+      <w:tr>
+        <w:trPr>
+          <w:tblHeader w:val="false"/>
+        </w:trPr>
+        <w:tc>
+          <w:tcPr>
+            <w:tcW w:type="dxa" w:w="700"/>
+            <w:tcMar>
+              <w:top w:type="dxa" w:w="60"/>
+              <w:left w:type="dxa" w:w="100"/>
+              <w:bottom w:type="dxa" w:w="60"/>
+              <w:right w:type="dxa" w:w="100"/>
+            </w:tcMar>
+          </w:tcPr>
+          <w:p>
+            <w:pPr>
+              <w:jc w:val="left"/>
+            </w:pPr>
+            <w:r>
+              <w:rPr>
+                <w:rFonts w:ascii="Arial" w:cs="Arial" w:eastAsia="Arial" w:hAnsi="Arial"/>
+                <w:b w:val="0"/>
+                <w:color w:val="000000"/>
+                <w:sz w:val="19"/>
+                <w:szCs w:val="19"/>
+              </w:rPr>
+              <w:t>0.70</w:t>
+            </w:r>
+          </w:p>
+        </w:tc>
+        <w:tc>
+          <w:tcPr>
+            <w:tcW w:type="dxa" w:w="1700"/>
+            <w:tcMar>
+              <w:top w:type="dxa" w:w="60"/>
+              <w:left w:type="dxa" w:w="100"/>
+              <w:bottom w:type="dxa" w:w="60"/>
+              <w:right w:type="dxa" w:w="100"/>
+            </w:tcMar>
+          </w:tcPr>
+          <w:p>
+            <w:pPr>
+              <w:jc w:val="left"/>
+            </w:pPr>
+            <w:r>
+              <w:rPr>
+                <w:rFonts w:ascii="Arial" w:cs="Arial" w:eastAsia="Arial" w:hAnsi="Arial"/>
+                <w:b w:val="0"/>
+                <w:color w:val="000000"/>
+                <w:sz w:val="19"/>
+                <w:szCs w:val="19"/>
+              </w:rPr>
+              <w:t>0</w:t>
+            </w:r>
+          </w:p>
+        </w:tc>
+        <w:tc>
+          <w:tcPr>
+            <w:tcW w:type="dxa" w:w="5200"/>
+            <w:tcMar>
+              <w:top w:type="dxa" w:w="60"/>
+              <w:left w:type="dxa" w:w="100"/>
+              <w:bottom w:type="dxa" w:w="60"/>
+              <w:right w:type="dxa" w:w="100"/>
+            </w:tcMar>
+          </w:tcPr>
+          <w:p>
+            <w:pPr>
+              <w:jc w:val="left"/>
+            </w:pPr>
+            <w:r>
+              <w:rPr>
+                <w:rFonts w:ascii="Arial" w:cs="Arial" w:eastAsia="Arial" w:hAnsi="Arial"/>
+                <w:b w:val="0"/>
+                <w:color w:val="000000"/>
+                <w:sz w:val="19"/>
+                <w:szCs w:val="19"/>
+              </w:rPr>
+              <w:t>0.3979</w:t>
+            </w:r>
+          </w:p>
+        </w:tc>
+        <w:tc>
+          <w:tcPr>
+            <w:tcW w:type="dxa" w:w="1760"/>
+            <w:tcMar>
+              <w:top w:type="dxa" w:w="60"/>
+              <w:left w:type="dxa" w:w="100"/>
+              <w:bottom w:type="dxa" w:w="60"/>
+              <w:right w:type="dxa" w:w="100"/>
+            </w:tcMar>
+          </w:tcPr>
+          <w:p>
+            <w:pPr>
+              <w:jc w:val="left"/>
+            </w:pPr>
+            <w:r>
+              <w:rPr>
+                <w:rFonts w:ascii="Arial" w:cs="Arial" w:eastAsia="Arial" w:hAnsi="Arial"/>
+                <w:b w:val="0"/>
+                <w:color w:val="000000"/>
+                <w:sz w:val="19"/>
+                <w:szCs w:val="19"/>
+              </w:rPr>
+              <w:t>0.3902</w:t>
+            </w:r>
+          </w:p>
+        </w:tc>
+      </w:tr>
+    </w:tbl>
+    <w:p>
+      <w:pPr>
+        <w:spacing w:after="200" w:before="80"/>
+        <w:jc w:val="center"/>
+      </w:pPr>
+      <w:r>
+        <w:rPr>
+          <w:b w:val="0"/>
+        </w:rPr>
+        <w:t>Table 6: Routed WER as a function of the English-detection threshold. Rows are the points at which the result changes; the full 21-point curve is in eval/speech/results/threshold_sweep.csv.</w:t>
+      </w:r>
+    </w:p>
+    <w:p>
+      <w:pPr>
+        <w:spacing w:after="120" w:line="300"/>
+      </w:pPr>
+      <w:r>
+        <w:rPr>
+          <w:b w:val="0"/>
+        </w:rPr>
+        <w:t>The lowest WER on this corpus is 0.2765 at a threshold of 0.05, against 0.3488 at the threshold actually used — a headroom of 0.072. That figure coincides, to four decimal places, with the oracle bound reported in Section 7, which was obtained by a different method; two independent routes to the same value is a useful consistency check on both.</w:t>
+      </w:r>
+    </w:p>
+    <w:p>
+      <w:pPr>
+        <w:spacing w:after="120" w:line="300"/>
+      </w:pPr>
+      <w:r>
+        <w:rPr>
+          <w:b/>
+        </w:rPr>
+        <w:t xml:space="preserve">Despite that headroom, </w:t>
+      </w:r>
+      <w:r>
+        <w:rPr>
+          <w:b w:val="0"/>
+        </w:rPr>
+        <w:t>the threshold was not moved, for two reasons. The first is methodological: selecting a decision rule by its score on the 48 clips it is then evaluated on is leakage, and the corpus is too small to hold out a tuning split. It is the same objection that prevented Malaysian entity names being added to the decoder prompt. The second is that the minimum is unstable. At a threshold of 0.05 one ms_dom clip (s07_pq, p_en = 0.084) crosses into English and happens to be transcribed correctly either way; the clip that does cause runaway repetition, s05_pq, sits far below and is not selected. The favourable result depends on which Malay clip happens to carry the higher probability. One step further down the grid, at a threshold of 0.00, the whole corpus is forced to English and WER rises to 1.274. The optimum on this data sits immediately beside a cliff, and a rule chosen there would not be expected to transfer to new speakers.</w:t>
+      </w:r>
+    </w:p>
+    <w:p>
+      <w:pPr>
+        <w:spacing w:after="120" w:line="300"/>
+      </w:pPr>
+      <w:r>
+        <w:rPr>
+          <w:b w:val="0"/>
+        </w:rPr>
+        <w:t>The reported configuration therefore retains the threshold chosen before measurement. Table 6 is presented as a sensitivity analysis: it quantifies what the caution costs on this corpus, and it makes the value of the constant an evidenced choice rather than an assumed one.</w:t>
+      </w:r>
+    </w:p>
+    <w:p>
+      <w:pPr>
+        <w:pStyle w:val="Heading2"/>
+        <w:spacing w:after="140" w:before="280"/>
+      </w:pPr>
+      <w:r>
+        <w:t>6. Error analysis by switch type</w:t>
       </w:r>
     </w:p>
     <w:tbl>
@@ -5935,13 +7882,30 @@
       </w:pPr>
       <w:r>
         <w:rPr>
+          <w:b/>
+        </w:rPr>
+        <w:t xml:space="preserve">en_dom (0.530) </w:t>
+      </w:r>
+      <w:r>
+        <w:rPr>
+          <w:b w:val="0"/>
+        </w:rPr>
+        <w:t>is a routing failure rather than a transcription failure. Five of its eight clips are routed to Malay and returned as Malay prose. Under forced English the same category scores 0.106, so the model can write these utterances correctly when it is told which language to use. Section 5 identifies the mechanism: the detector assigns these clips a median English probability of 0.234, below the 0.5 threshold, while still detecting English in all eight. The remedy is a better-calibrated detector, not a better transcriber.</w:t>
+      </w:r>
+    </w:p>
+    <w:p>
+      <w:pPr>
+        <w:spacing w:after="120" w:line="300"/>
+      </w:pPr>
+      <w:r>
+        <w:rPr>
           <w:rFonts w:ascii="Arial" w:cs="Arial" w:eastAsia="Arial" w:hAnsi="Arial"/>
           <w:b/>
           <w:bCs/>
           <w:sz w:val="22"/>
           <w:szCs w:val="22"/>
         </w:rPr>
-        <w:t xml:space="preserve">Excluding the two categories with identified external causes, </w:t>
+        <w:t>Excluding the two weakest categories, the remaining 240 reference words (62% of the corpus) score 0.238 — within the proposal's ≤0.25 target. The two exclusions are not equally defensible and should not be read as equivalent: numeric is a scoring artefact arising outside the system, whereas en_dom is a failure of a component of this system. The 0.349 figure over the full corpus remains the headline result.</w:t>
       </w:r>
       <w:r>
         <w:rPr>
@@ -5949,7 +7913,6 @@
           <w:sz w:val="22"/>
           <w:szCs w:val="22"/>
         </w:rPr>
-        <w:t xml:space="preserve">the remaining 240 reference words (62% of the corpus) score 0.238 — within the proposal's ≤0.25 target.</w:t>
       </w:r>
     </w:p>
     <w:p>
@@ -5958,7 +7921,7 @@
         <w:spacing w:after="140" w:before="280"/>
       </w:pPr>
       <w:r>
-        <w:t xml:space="preserve">6. Assessment against the target</w:t>
+        <w:t>7. Assessment against the target</w:t>
       </w:r>
     </w:p>
     <w:p>
@@ -6006,7 +7969,7 @@
         <w:spacing w:after="140" w:before="280"/>
       </w:pPr>
       <w:r>
-        <w:t xml:space="preserve">7. Threats to validity</w:t>
+        <w:t>8. Threats to validity</w:t>
       </w:r>
     </w:p>
     <w:p>
@@ -6082,6 +8045,23 @@
       </w:r>
     </w:p>
     <w:p>
+      <w:pPr>
+        <w:spacing w:after="120" w:line="300"/>
+      </w:pPr>
+      <w:r>
+        <w:rPr>
+          <w:b/>
+        </w:rPr>
+        <w:t xml:space="preserve">Speaker-dependent language detection: </w:t>
+      </w:r>
+      <w:r>
+        <w:rPr>
+          <w:b w:val="0"/>
+        </w:rPr>
+        <w:t>every clip routed to English belongs to one speaker. None of the other speaker's 24 clips crossed the threshold in any category. Mean p_en is 0.136 for the first speaker against 0.043 for the second, and within en_dom the second speaker's maximum (0.263) falls below the first speaker's median (0.611). With four clips per speaker per category this is an observation rather than a demonstrated effect, but it is large and one-directional, and it is consistent with the detector being sensitive to speaker accent. It follows that the en_dom result is in part a property of who recorded the corpus. Recording further speakers is the appropriate follow-up; the stratified design is what made the pattern visible.</w:t>
+      </w:r>
+    </w:p>
+    <w:p>
       <w:r>
         <w:br w:type="page"/>
       </w:r>
@@ -6127,7 +8107,7 @@
           <w:sz w:val="17"/>
           <w:szCs w:val="17"/>
         </w:rPr>
-        <w:t xml:space="preserve">def detect_lang(path: str) -&gt; str:</w:t>
+        <w:t>EN_THRESHOLD = 0.5</w:t>
       </w:r>
     </w:p>
     <w:p>
@@ -6140,7 +8120,6 @@
           <w:sz w:val="17"/>
           <w:szCs w:val="17"/>
         </w:rPr>
-        <w:t xml:space="preserve">    """Detect spoken language with vanilla Whisper's encoder.</w:t>
       </w:r>
     </w:p>
     <w:p>
@@ -6153,7 +8132,7 @@
           <w:sz w:val="17"/>
           <w:szCs w:val="17"/>
         </w:rPr>
-        <w:t xml:space="preserve"/>
+        <w:t>def detect_lang(path: str) -&gt; tuple[str, float]:</w:t>
       </w:r>
     </w:p>
     <w:p>
@@ -6166,7 +8145,7 @@
           <w:sz w:val="17"/>
           <w:szCs w:val="17"/>
         </w:rPr>
-        <w:t xml:space="preserve">    The Mesolitica checkpoint transcribes English well when told to (en_dom 0.106</w:t>
+        <w:t xml:space="preserve">    """Detect spoken language with vanilla Whisper's encoder.</w:t>
       </w:r>
     </w:p>
     <w:p>
@@ -6179,7 +8158,6 @@
           <w:sz w:val="17"/>
           <w:szCs w:val="17"/>
         </w:rPr>
-        <w:t xml:space="preserve">    under forced English) but its own detection always lands on Malay, so English</w:t>
       </w:r>
     </w:p>
     <w:p>
@@ -6192,7 +8170,7 @@
           <w:sz w:val="17"/>
           <w:szCs w:val="17"/>
         </w:rPr>
-        <w:t xml:space="preserve">    clips come back translated at 0.788. Vanilla Whisper's detector is unbiased and</w:t>
+        <w:t xml:space="preserve">    The Mesolitica checkpoint transcribes English well when told to (en_dom 0.106</w:t>
       </w:r>
     </w:p>
     <w:p>
@@ -6205,7 +8183,7 @@
           <w:sz w:val="17"/>
           <w:szCs w:val="17"/>
         </w:rPr>
-        <w:t xml:space="preserve">    costs one encoder pass; it only CHOOSES the language token -- the Malaysian</w:t>
+        <w:t xml:space="preserve">    under forced English) but its own detection always lands on Malay, so English</w:t>
       </w:r>
     </w:p>
     <w:p>
@@ -6218,7 +8196,7 @@
           <w:sz w:val="17"/>
           <w:szCs w:val="17"/>
         </w:rPr>
-        <w:t xml:space="preserve">    model still does the transcribing.</w:t>
+        <w:t xml:space="preserve">    clips come back translated at 0.788. Vanilla Whisper's detector is unbiased and</w:t>
       </w:r>
     </w:p>
     <w:p>
@@ -6231,7 +8209,7 @@
           <w:sz w:val="17"/>
           <w:szCs w:val="17"/>
         </w:rPr>
-        <w:t xml:space="preserve">    """</w:t>
+        <w:t xml:space="preserve">    costs one encoder pass; it only CHOOSES the language token -- the Malaysian</w:t>
       </w:r>
     </w:p>
     <w:p>
@@ -6244,7 +8222,7 @@
           <w:sz w:val="17"/>
           <w:szCs w:val="17"/>
         </w:rPr>
-        <w:t xml:space="preserve">    m = get_vanilla()</w:t>
+        <w:t xml:space="preserve">    model still does the transcribing.</w:t>
       </w:r>
     </w:p>
     <w:p>
@@ -6257,7 +8235,6 @@
           <w:sz w:val="17"/>
           <w:szCs w:val="17"/>
         </w:rPr>
-        <w:t xml:space="preserve">    mel = whisper.log_mel_spectrogram(</w:t>
       </w:r>
     </w:p>
     <w:p>
@@ -6270,7 +8247,7 @@
           <w:sz w:val="17"/>
           <w:szCs w:val="17"/>
         </w:rPr>
-        <w:t xml:space="preserve">        whisper.pad_or_trim(whisper.load_audio(path)), n_mels=m.dims.n_mels</w:t>
+        <w:t xml:space="preserve">    Returns (choice, p_en). The probability is returned as well as the decision</w:t>
       </w:r>
     </w:p>
     <w:p>
@@ -6283,7 +8260,7 @@
           <w:sz w:val="17"/>
           <w:szCs w:val="17"/>
         </w:rPr>
-        <w:t xml:space="preserve">    ).to(m.device)</w:t>
+        <w:t xml:space="preserve">    because the decision alone cannot distinguish a clip missed narrowly (p_en just</w:t>
       </w:r>
     </w:p>
     <w:p>
@@ -6296,7 +8273,7 @@
           <w:sz w:val="17"/>
           <w:szCs w:val="17"/>
         </w:rPr>
-        <w:t xml:space="preserve">    _, probs = m.detect_language(mel)</w:t>
+        <w:t xml:space="preserve">    below the threshold, so the cutoff is mis-set) from one missed completely (p_en</w:t>
       </w:r>
     </w:p>
     <w:p>
@@ -6309,7 +8286,7 @@
           <w:sz w:val="17"/>
           <w:szCs w:val="17"/>
         </w:rPr>
-        <w:t xml:space="preserve">    top = max(probs, key=probs.get)</w:t>
+        <w:t xml:space="preserve">    near zero, so no threshold would recover it).</w:t>
       </w:r>
     </w:p>
     <w:p>
@@ -6322,7 +8299,7 @@
           <w:sz w:val="17"/>
           <w:szCs w:val="17"/>
         </w:rPr>
-        <w:t xml:space="preserve">    # Asymmetric threshold: forcing English on Malay audio is catastrophic</w:t>
+        <w:t xml:space="preserve">    """</w:t>
       </w:r>
     </w:p>
     <w:p>
@@ -6335,7 +8312,7 @@
           <w:sz w:val="17"/>
           <w:szCs w:val="17"/>
         </w:rPr>
-        <w:t xml:space="preserve">    # (6.483 WER, runaway repetition) while the reverse merely translates (0.788).</w:t>
+        <w:t xml:space="preserve">    m = get_vanilla()</w:t>
       </w:r>
     </w:p>
     <w:p>
@@ -6348,7 +8325,124 @@
           <w:sz w:val="17"/>
           <w:szCs w:val="17"/>
         </w:rPr>
-        <w:t xml:space="preserve">    return "en" if top == "en" and probs["en"] &gt; 0.5 else "ms"</w:t>
+        <w:t xml:space="preserve">    mel = whisper.log_mel_spectrogram(</w:t>
+      </w:r>
+    </w:p>
+    <w:p>
+      <w:pPr>
+        <w:spacing w:after="0" w:line="230"/>
+      </w:pPr>
+      <w:r>
+        <w:rPr>
+          <w:rFonts w:ascii="Consolas" w:cs="Consolas" w:eastAsia="Consolas" w:hAnsi="Consolas"/>
+          <w:sz w:val="17"/>
+          <w:szCs w:val="17"/>
+        </w:rPr>
+        <w:t xml:space="preserve">        whisper.pad_or_trim(whisper.load_audio(path)), n_mels=m.dims.n_mels</w:t>
+      </w:r>
+    </w:p>
+    <w:p>
+      <w:pPr>
+        <w:spacing w:after="0" w:line="230"/>
+      </w:pPr>
+      <w:r>
+        <w:rPr>
+          <w:rFonts w:ascii="Consolas" w:cs="Consolas" w:eastAsia="Consolas" w:hAnsi="Consolas"/>
+          <w:sz w:val="17"/>
+          <w:szCs w:val="17"/>
+        </w:rPr>
+        <w:t xml:space="preserve">    ).to(m.device)</w:t>
+      </w:r>
+    </w:p>
+    <w:p>
+      <w:pPr>
+        <w:spacing w:after="0" w:line="230"/>
+      </w:pPr>
+      <w:r>
+        <w:rPr>
+          <w:rFonts w:ascii="Consolas" w:cs="Consolas" w:eastAsia="Consolas" w:hAnsi="Consolas"/>
+          <w:sz w:val="17"/>
+          <w:szCs w:val="17"/>
+        </w:rPr>
+        <w:t xml:space="preserve">    _, probs = m.detect_language(mel)</w:t>
+      </w:r>
+    </w:p>
+    <w:p>
+      <w:pPr>
+        <w:spacing w:after="0" w:line="230"/>
+      </w:pPr>
+      <w:r>
+        <w:rPr>
+          <w:rFonts w:ascii="Consolas" w:cs="Consolas" w:eastAsia="Consolas" w:hAnsi="Consolas"/>
+          <w:sz w:val="17"/>
+          <w:szCs w:val="17"/>
+        </w:rPr>
+        <w:t xml:space="preserve">    top = max(probs, key=probs.get)</w:t>
+      </w:r>
+    </w:p>
+    <w:p>
+      <w:pPr>
+        <w:spacing w:after="0" w:line="230"/>
+      </w:pPr>
+      <w:r>
+        <w:rPr>
+          <w:rFonts w:ascii="Consolas" w:cs="Consolas" w:eastAsia="Consolas" w:hAnsi="Consolas"/>
+          <w:sz w:val="17"/>
+          <w:szCs w:val="17"/>
+        </w:rPr>
+        <w:t xml:space="preserve">    p_en = float(probs.get("en", 0.0))</w:t>
+      </w:r>
+    </w:p>
+    <w:p>
+      <w:pPr>
+        <w:spacing w:after="0" w:line="230"/>
+      </w:pPr>
+      <w:r>
+        <w:rPr>
+          <w:rFonts w:ascii="Consolas" w:cs="Consolas" w:eastAsia="Consolas" w:hAnsi="Consolas"/>
+          <w:sz w:val="17"/>
+          <w:szCs w:val="17"/>
+        </w:rPr>
+        <w:t xml:space="preserve">    # Asymmetric threshold: forcing English on Malay audio is usually harmless but</w:t>
+      </w:r>
+    </w:p>
+    <w:p>
+      <w:pPr>
+        <w:spacing w:after="0" w:line="230"/>
+      </w:pPr>
+      <w:r>
+        <w:rPr>
+          <w:rFonts w:ascii="Consolas" w:cs="Consolas" w:eastAsia="Consolas" w:hAnsi="Consolas"/>
+          <w:sz w:val="17"/>
+          <w:szCs w:val="17"/>
+        </w:rPr>
+        <w:t xml:space="preserve">    # occasionally unbounded -- one clip contributed 362 insertions on 7 reference</w:t>
+      </w:r>
+    </w:p>
+    <w:p>
+      <w:pPr>
+        <w:spacing w:after="0" w:line="230"/>
+      </w:pPr>
+      <w:r>
+        <w:rPr>
+          <w:rFonts w:ascii="Consolas" w:cs="Consolas" w:eastAsia="Consolas" w:hAnsi="Consolas"/>
+          <w:sz w:val="17"/>
+          <w:szCs w:val="17"/>
+        </w:rPr>
+        <w:t xml:space="preserve">    # words -- while the reverse merely translates (0.788).</w:t>
+      </w:r>
+    </w:p>
+    <w:p>
+      <w:pPr>
+        <w:spacing w:after="0" w:line="230"/>
+      </w:pPr>
+      <w:r>
+        <w:rPr>
+          <w:rFonts w:ascii="Consolas" w:cs="Consolas" w:eastAsia="Consolas" w:hAnsi="Consolas"/>
+          <w:sz w:val="17"/>
+          <w:szCs w:val="17"/>
+        </w:rPr>
+        <w:t xml:space="preserve">    return ("en" if top == "en" and p_en &gt; EN_THRESHOLD else "ms"), p_en</w:t>
       </w:r>
     </w:p>
     <w:p>
@@ -6941,6 +9035,177 @@
                 <w:szCs w:val="19"/>
               </w:rPr>
               <w:t xml:space="preserve">Generated result tables</w:t>
+            </w:r>
+          </w:p>
+        </w:tc>
+      </w:tr>
+      <w:tr>
+        <w:trPr>
+          <w:tblHeader w:val="false"/>
+        </w:trPr>
+        <w:tc>
+          <w:tcPr>
+            <w:tcW w:type="dxa" w:w="3400"/>
+            <w:tcMar>
+              <w:top w:type="dxa" w:w="60"/>
+              <w:left w:type="dxa" w:w="100"/>
+              <w:bottom w:type="dxa" w:w="60"/>
+              <w:right w:type="dxa" w:w="100"/>
+            </w:tcMar>
+          </w:tcPr>
+          <w:p>
+            <w:pPr>
+              <w:jc w:val="left"/>
+            </w:pPr>
+            <w:r>
+              <w:rPr>
+                <w:rFonts w:ascii="Arial" w:cs="Arial" w:eastAsia="Arial" w:hAnsi="Arial"/>
+                <w:b w:val="0"/>
+                <w:color w:val="000000"/>
+                <w:sz w:val="19"/>
+                <w:szCs w:val="19"/>
+              </w:rPr>
+              <w:t>eval/speech/threshold_sweep.py</w:t>
+            </w:r>
+          </w:p>
+        </w:tc>
+        <w:tc>
+          <w:tcPr>
+            <w:tcW w:type="dxa" w:w="5960"/>
+            <w:tcMar>
+              <w:top w:type="dxa" w:w="60"/>
+              <w:left w:type="dxa" w:w="100"/>
+              <w:bottom w:type="dxa" w:w="60"/>
+              <w:right w:type="dxa" w:w="100"/>
+            </w:tcMar>
+          </w:tcPr>
+          <w:p>
+            <w:pPr>
+              <w:jc w:val="left"/>
+            </w:pPr>
+            <w:r>
+              <w:rPr>
+                <w:rFonts w:ascii="Arial" w:cs="Arial" w:eastAsia="Arial" w:hAnsi="Arial"/>
+                <w:b w:val="0"/>
+                <w:color w:val="000000"/>
+                <w:sz w:val="19"/>
+                <w:szCs w:val="19"/>
+              </w:rPr>
+              <w:t>Reconstructs routed WER across detection thresholds from cached transcripts</w:t>
+            </w:r>
+          </w:p>
+        </w:tc>
+      </w:tr>
+      <w:tr>
+        <w:trPr>
+          <w:tblHeader w:val="false"/>
+        </w:trPr>
+        <w:tc>
+          <w:tcPr>
+            <w:tcW w:type="dxa" w:w="3400"/>
+            <w:tcMar>
+              <w:top w:type="dxa" w:w="60"/>
+              <w:left w:type="dxa" w:w="100"/>
+              <w:bottom w:type="dxa" w:w="60"/>
+              <w:right w:type="dxa" w:w="100"/>
+            </w:tcMar>
+          </w:tcPr>
+          <w:p>
+            <w:pPr>
+              <w:jc w:val="left"/>
+            </w:pPr>
+            <w:r>
+              <w:rPr>
+                <w:rFonts w:ascii="Arial" w:cs="Arial" w:eastAsia="Arial" w:hAnsi="Arial"/>
+                <w:b w:val="0"/>
+                <w:color w:val="000000"/>
+                <w:sz w:val="19"/>
+                <w:szCs w:val="19"/>
+              </w:rPr>
+              <w:t>eval/speech/sync_report_figures.py</w:t>
+            </w:r>
+          </w:p>
+        </w:tc>
+        <w:tc>
+          <w:tcPr>
+            <w:tcW w:type="dxa" w:w="5960"/>
+            <w:tcMar>
+              <w:top w:type="dxa" w:w="60"/>
+              <w:left w:type="dxa" w:w="100"/>
+              <w:bottom w:type="dxa" w:w="60"/>
+              <w:right w:type="dxa" w:w="100"/>
+            </w:tcMar>
+          </w:tcPr>
+          <w:p>
+            <w:pPr>
+              <w:jc w:val="left"/>
+            </w:pPr>
+            <w:r>
+              <w:rPr>
+                <w:rFonts w:ascii="Arial" w:cs="Arial" w:eastAsia="Arial" w:hAnsi="Arial"/>
+                <w:b w:val="0"/>
+                <w:color w:val="000000"/>
+                <w:sz w:val="19"/>
+                <w:szCs w:val="19"/>
+              </w:rPr>
+              <w:t>Regenerates this report's result tables from the CSVs</w:t>
+            </w:r>
+          </w:p>
+        </w:tc>
+      </w:tr>
+      <w:tr>
+        <w:trPr>
+          <w:tblHeader w:val="false"/>
+        </w:trPr>
+        <w:tc>
+          <w:tcPr>
+            <w:tcW w:type="dxa" w:w="3400"/>
+            <w:tcMar>
+              <w:top w:type="dxa" w:w="60"/>
+              <w:left w:type="dxa" w:w="100"/>
+              <w:bottom w:type="dxa" w:w="60"/>
+              <w:right w:type="dxa" w:w="100"/>
+            </w:tcMar>
+          </w:tcPr>
+          <w:p>
+            <w:pPr>
+              <w:jc w:val="left"/>
+            </w:pPr>
+            <w:r>
+              <w:rPr>
+                <w:rFonts w:ascii="Arial" w:cs="Arial" w:eastAsia="Arial" w:hAnsi="Arial"/>
+                <w:b w:val="0"/>
+                <w:color w:val="000000"/>
+                <w:sz w:val="19"/>
+                <w:szCs w:val="19"/>
+              </w:rPr>
+              <w:t>eval/speech/results/*.csv</w:t>
+            </w:r>
+          </w:p>
+        </w:tc>
+        <w:tc>
+          <w:tcPr>
+            <w:tcW w:type="dxa" w:w="5960"/>
+            <w:tcMar>
+              <w:top w:type="dxa" w:w="60"/>
+              <w:left w:type="dxa" w:w="100"/>
+              <w:bottom w:type="dxa" w:w="60"/>
+              <w:right w:type="dxa" w:w="100"/>
+            </w:tcMar>
+          </w:tcPr>
+          <w:p>
+            <w:pPr>
+              <w:jc w:val="left"/>
+            </w:pPr>
+            <w:r>
+              <w:rPr>
+                <w:rFonts w:ascii="Arial" w:cs="Arial" w:eastAsia="Arial" w:hAnsi="Arial"/>
+                <w:b w:val="0"/>
+                <w:color w:val="000000"/>
+                <w:sz w:val="19"/>
+                <w:szCs w:val="19"/>
+              </w:rPr>
+              <w:t>Committed result tables, including detector_probs.csv and threshold_sweep.csv</w:t>
             </w:r>
           </w:p>
         </w:tc>

</xml_diff>